<commit_message>
Fill Task 4 joint rotation test in Task 1 textbook format
Add 任务描述, 任务目标, facilities, hours, and generalized 知识储备
for 腿部关节转动测试与调试; keep original 4.1–4.7 implementation.

Co-authored-by: FrankBooom <FrankBooom@users.noreply.github.com>
</commit_message>
<xml_diff>
--- a/docs/项目二 腿部机械装配-已补全.docx
+++ b/docs/项目二 腿部机械装配-已补全.docx
@@ -3230,6 +3230,9 @@
           <w:szCs w:val="32"/>
         </w:rPr>
       </w:pPr>
+      <w:r>
+        <w:t xml:space="preserve">本任务在腿部主体结构装配合格的基础上，完成关节转动测试与调试。学员按“静态校准、动态联调、故障整改、复检验收”实施，掌握通电前完备性检查、零位与参数复核、绝缘安全、髋膝踝极限角度与双腿对称、动态电参数与噪声监控、耐久运行及缺陷分级归档，判定腿部模组转动调试合格。</w:t>
+      </w:r>
     </w:p>
     <w:p>
       <w:pPr>
@@ -3269,14 +3272,108 @@
       </w:r>
     </w:p>
     <w:p>
-      <w:pPr>
-        <w:rPr>
-          <w:rFonts w:asciiTheme="majorHAnsi" w:eastAsiaTheme="majorEastAsia" w:hAnsiTheme="majorHAnsi" w:cstheme="majorBidi" w:hint="eastAsia"/>
-          <w:color w:val="0F4761" w:themeColor="accent1" w:themeShade="BF"/>
-          <w:sz w:val="32"/>
-          <w:szCs w:val="32"/>
-        </w:rPr>
-      </w:pPr>
+      <w:r>
+        <w:rPr>
+          <w:rFonts w:hint="eastAsia"/>
+        </w:rPr>
+        <w:t>知识点</w:t>
+      </w:r>
+    </w:p>
+    <w:p>
+      <w:r>
+        <w:t>通电前线缆、紧固件完备性检查及绝缘对地电压的合格条件</w:t>
+      </w:r>
+    </w:p>
+    <w:p>
+      <w:r>
+        <w:t>机械零位与电气零位对齐、控制参数版本匹配及回读生效的要求</w:t>
+      </w:r>
+    </w:p>
+    <w:p>
+      <w:r>
+        <w:t>髋、膝、踝极限角度标称值、±2°允许偏差及双腿对称度判定</w:t>
+      </w:r>
+    </w:p>
+    <w:p>
+      <w:r>
+        <w:t>动态运行中母线电压、绕组温度、噪声与耐久的监控指标</w:t>
+      </w:r>
+    </w:p>
+    <w:p>
+      <w:r>
+        <w:t>缺陷分级整改时限及验收归档资料构成</w:t>
+      </w:r>
+    </w:p>
+    <w:p>
+      <w:r>
+        <w:rPr>
+          <w:rFonts w:hint="eastAsia"/>
+        </w:rPr>
+        <w:t>技能点</w:t>
+      </w:r>
+    </w:p>
+    <w:p>
+      <w:r>
+        <w:t>能搭建髋座固定工装，在断电状态下检查动力线、信号线、CAN/编码器线序及承力螺栓拧紧标记</w:t>
+      </w:r>
+    </w:p>
+    <w:p>
+      <w:r>
+        <w:t>能将各关节调至中立位核对刻度线，导入并回读控制参数，完成回零验证</w:t>
+      </w:r>
+    </w:p>
+    <w:p>
+      <w:r>
+        <w:t>能用万用表检测关节壳体、连杆等裸露金属对地电压，判定＜3V</w:t>
+      </w:r>
+    </w:p>
+    <w:p>
+      <w:r>
+        <w:t>能在单关节点动下测量髋、膝、踝极限角度，判定与标称值偏差≤±2°且极限位无干涉</w:t>
+      </w:r>
+    </w:p>
+    <w:p>
+      <w:r>
+        <w:t>能开展全行程往复、电参数采集和噪声测试，记录电压、温度、噪声数据</w:t>
+      </w:r>
+    </w:p>
+    <w:p>
+      <w:r>
+        <w:t>能按致命、严重、一般缺陷分级整改，并归档完备性、零位、动态、耐久及闭环记录</w:t>
+      </w:r>
+    </w:p>
+    <w:p>
+      <w:pPr>
+        <w:rPr>
+          <w:rFonts w:hint="eastAsia"/>
+        </w:rPr>
+      </w:pPr>
+      <w:r>
+        <w:rPr>
+          <w:rFonts w:hint="eastAsia"/>
+        </w:rPr>
+        <w:t>素养目标</w:t>
+      </w:r>
+    </w:p>
+    <w:p>
+      <w:r>
+        <w:t>先安全后通电，绝缘或接线不合格不得驱动</w:t>
+      </w:r>
+    </w:p>
+    <w:p>
+      <w:r>
+        <w:t>测试数据如实记录，不改点、不漏项、不事后凑数</w:t>
+      </w:r>
+    </w:p>
+    <w:p>
+      <w:r>
+        <w:t>缺陷分级闭环，不带病验收</w:t>
+      </w:r>
+    </w:p>
+    <w:p>
+      <w:r>
+        <w:t>遵守工装固定与点动安全，遇卡死、过热立即停机</w:t>
+      </w:r>
     </w:p>
     <w:p>
       <w:pPr>
@@ -3324,6 +3421,9 @@
           <w:szCs w:val="32"/>
         </w:rPr>
       </w:pPr>
+      <w:r>
+        <w:t xml:space="preserve">已装配完成的机器人腿部总成、机器人主控系统、上位机调试电脑、通讯数据线；腿部固定工装（吊装架）、72V 稳压直流电源、高精度数显角度尺、万用表、红外测温仪、声级计、扭矩复检扳手；调试记录台账、参数备份文件</w:t>
+      </w:r>
     </w:p>
     <w:p>
       <w:pPr>
@@ -3371,6 +3471,9 @@
           <w:szCs w:val="32"/>
         </w:rPr>
       </w:pPr>
+      <w:r>
+        <w:t xml:space="preserve">参考学时：8个学时</w:t>
+      </w:r>
     </w:p>
     <w:p>
       <w:pPr>
@@ -3411,13 +3514,359 @@
     </w:p>
     <w:p>
       <w:pPr>
-        <w:rPr>
-          <w:rFonts w:asciiTheme="majorHAnsi" w:eastAsiaTheme="majorEastAsia" w:hAnsiTheme="majorHAnsi" w:cstheme="majorBidi" w:hint="eastAsia"/>
-          <w:color w:val="0F4761" w:themeColor="accent1" w:themeShade="BF"/>
-          <w:sz w:val="32"/>
-          <w:szCs w:val="32"/>
-        </w:rPr>
-      </w:pPr>
+        <w:pStyle w:val="a9"/>
+        <w:numPr>
+          <w:ilvl w:val="0"/>
+          <w:numId w:val="24"/>
+        </w:numPr>
+        <w:rPr>
+          <w:rFonts w:asciiTheme="majorHAnsi" w:eastAsiaTheme="majorEastAsia" w:hAnsiTheme="majorHAnsi" w:cstheme="majorBidi"/>
+          <w:color w:val="0F4761" w:themeColor="accent1" w:themeShade="BF"/>
+          <w:sz w:val="32"/>
+          <w:szCs w:val="32"/>
+        </w:rPr>
+      </w:pPr>
+      <w:bookmarkStart w:id="0" w:name="OLE_LINK1"/>
+      <w:r>
+        <w:rPr>
+          <w:rFonts w:asciiTheme="majorHAnsi" w:eastAsiaTheme="majorEastAsia" w:hAnsiTheme="majorHAnsi" w:cstheme="majorBidi" w:hint="eastAsia"/>
+          <w:color w:val="0F4761" w:themeColor="accent1" w:themeShade="BF"/>
+          <w:sz w:val="32"/>
+          <w:szCs w:val="32"/>
+        </w:rPr>
+        <w:t>通电安全与完备性</w:t>
+      </w:r>
+    </w:p>
+    <w:p>
+      <w:r>
+        <w:rPr>
+          <w:rFonts w:hint="eastAsia"/>
+        </w:rPr>
+        <w:t>1.1 工装约束与电源条件</w:t>
+      </w:r>
+    </w:p>
+    <w:p>
+      <w:pPr>
+        <w:ind w:firstLine="420"/>
+      </w:pPr>
+      <w:r>
+        <w:t>通电转动测试必须把髋座刚性固定在工装上，使测量和驱动的反力由工装承受，而不是由未约束的整机晃动承受。驱动电源应与关节额定母线一致，本任务为 72V 稳压直流。环境、总成完整性未确认前，不得进入带电环节。</w:t>
+      </w:r>
+    </w:p>
+    <w:p>
+      <w:r>
+        <w:rPr>
+          <w:rFonts w:hint="eastAsia"/>
+        </w:rPr>
+        <w:t>1.2 断电检查线缆与紧固</w:t>
+      </w:r>
+    </w:p>
+    <w:p>
+      <w:pPr>
+        <w:ind w:firstLine="420"/>
+      </w:pPr>
+      <w:r>
+        <w:t>上电前必须在断电状态下检查：动力线与信号线插合、锁扣到位；CAN 总线与编码器线序无反接、错接；接头轻拉不脱落；走线有运动余量、无锐角弯折。同时按 BOM 核对结构件齐全、无变形，承力螺栓有拧紧标记、无错漏装滑丝，减震垫和线束防护件到位。接线错误或紧固缺失时通电，可能短路、飞车或结构松脱。</w:t>
+      </w:r>
+    </w:p>
+    <w:p>
+      <w:r>
+        <w:rPr>
+          <w:rFonts w:hint="eastAsia"/>
+        </w:rPr>
+        <w:t>1.3 绝缘与对地电压</w:t>
+      </w:r>
+    </w:p>
+    <w:p>
+      <w:pPr>
+        <w:ind w:firstLine="420"/>
+      </w:pPr>
+      <w:r>
+        <w:t>金属壳体、连杆、螺栓头对电源负极不应出现危险电位。用直流电压档在待机及不同电压等级下测量裸露金属，对地电压须小于 3V。绝缘失效属于致命缺陷，不得以“能转动”代替绝缘判断。</w:t>
+      </w:r>
+    </w:p>
+    <w:p>
+      <w:pPr>
+        <w:pStyle w:val="a9"/>
+        <w:numPr>
+          <w:ilvl w:val="0"/>
+          <w:numId w:val="24"/>
+        </w:numPr>
+        <w:rPr>
+          <w:rFonts w:asciiTheme="majorHAnsi" w:eastAsiaTheme="majorEastAsia" w:hAnsiTheme="majorHAnsi" w:cstheme="majorBidi"/>
+          <w:color w:val="0F4761" w:themeColor="accent1" w:themeShade="BF"/>
+          <w:sz w:val="32"/>
+          <w:szCs w:val="32"/>
+        </w:rPr>
+      </w:pPr>
+      <w:bookmarkStart w:id="0" w:name="OLE_LINK1"/>
+      <w:r>
+        <w:rPr>
+          <w:rFonts w:asciiTheme="majorHAnsi" w:eastAsiaTheme="majorEastAsia" w:hAnsiTheme="majorHAnsi" w:cstheme="majorBidi" w:hint="eastAsia"/>
+          <w:color w:val="0F4761" w:themeColor="accent1" w:themeShade="BF"/>
+          <w:sz w:val="32"/>
+          <w:szCs w:val="32"/>
+        </w:rPr>
+        <w:t>零位与控制参数</w:t>
+      </w:r>
+    </w:p>
+    <w:p>
+      <w:r>
+        <w:rPr>
+          <w:rFonts w:hint="eastAsia"/>
+        </w:rPr>
+        <w:t>2.1 机械零位与电气零位</w:t>
+      </w:r>
+    </w:p>
+    <w:p>
+      <w:pPr>
+        <w:ind w:firstLine="420"/>
+      </w:pPr>
+      <w:r>
+        <w:t>机械零位是关节处于设计中立位时壳体与输出法兰刻度线的对齐状态；电气零位是驱动器保存的零点参数。装配后两者可能不一致，需要读取出厂零点、对比实际机械零位，必要时写入零点偏移。只看软件零点或只看刻度，都会把装配偏差带进运动。</w:t>
+      </w:r>
+    </w:p>
+    <w:p>
+      <w:r>
+        <w:rPr>
+          <w:rFonts w:hint="eastAsia"/>
+        </w:rPr>
+        <w:t>2.2 回零验证</w:t>
+      </w:r>
+    </w:p>
+    <w:p>
+      <w:pPr>
+        <w:ind w:firstLine="420"/>
+      </w:pPr>
+      <w:r>
+        <w:t>参数修改后应断电重启，再下发回零指令，确认回零姿态与机械中立位一致。回零失败说明偏移未生效、方向接反或机械卡滞，不得进入极限角度测试。</w:t>
+      </w:r>
+    </w:p>
+    <w:p>
+      <w:r>
+        <w:rPr>
+          <w:rFonts w:hint="eastAsia"/>
+        </w:rPr>
+        <w:t>2.3 控制参数的构成与版本</w:t>
+      </w:r>
+    </w:p>
+    <w:p>
+      <w:pPr>
+        <w:ind w:firstLine="420"/>
+      </w:pPr>
+      <w:r>
+        <w:t>腿部运动依赖位置环 PID、速度环 PID、转矩限幅和限位阈值。参数必须与关节标定固件版本匹配，内容完整、无缺失乱码。版本不一致会出现限幅失效、振荡或限位不起作用。</w:t>
+      </w:r>
+    </w:p>
+    <w:p>
+      <w:r>
+        <w:rPr>
+          <w:rFonts w:hint="eastAsia"/>
+        </w:rPr>
+        <w:t>2.4 下发与回读</w:t>
+      </w:r>
+    </w:p>
+    <w:p>
+      <w:pPr>
+        <w:ind w:firstLine="420"/>
+      </w:pPr>
+      <w:r>
+        <w:t>参数写入驱动器后必须重启回读，确认保存并生效。只下发不回读，无法证明控制器实际使用的就是导入文件。</w:t>
+      </w:r>
+    </w:p>
+    <w:p>
+      <w:pPr>
+        <w:pStyle w:val="a9"/>
+        <w:numPr>
+          <w:ilvl w:val="0"/>
+          <w:numId w:val="24"/>
+        </w:numPr>
+        <w:rPr>
+          <w:rFonts w:asciiTheme="majorHAnsi" w:eastAsiaTheme="majorEastAsia" w:hAnsiTheme="majorHAnsi" w:cstheme="majorBidi"/>
+          <w:color w:val="0F4761" w:themeColor="accent1" w:themeShade="BF"/>
+          <w:sz w:val="32"/>
+          <w:szCs w:val="32"/>
+        </w:rPr>
+      </w:pPr>
+      <w:bookmarkStart w:id="0" w:name="OLE_LINK1"/>
+      <w:r>
+        <w:rPr>
+          <w:rFonts w:asciiTheme="majorHAnsi" w:eastAsiaTheme="majorEastAsia" w:hAnsiTheme="majorHAnsi" w:cstheme="majorBidi" w:hint="eastAsia"/>
+          <w:color w:val="0F4761" w:themeColor="accent1" w:themeShade="BF"/>
+          <w:sz w:val="32"/>
+          <w:szCs w:val="32"/>
+        </w:rPr>
+        <w:t>极限角度与对称度</w:t>
+      </w:r>
+    </w:p>
+    <w:p>
+      <w:r>
+        <w:rPr>
+          <w:rFonts w:hint="eastAsia"/>
+        </w:rPr>
+        <w:t>3.1 关节自由度与标称行程</w:t>
+      </w:r>
+    </w:p>
+    <w:p>
+      <w:pPr>
+        <w:ind w:firstLine="420"/>
+      </w:pPr>
+      <w:r>
+        <w:t>髋关节含俯仰、侧摆和旋转：俯仰向前抬腿 108°、向后摆腿 77°；侧摆向内 10°、向外 25°；内外旋转合计 40°。膝关节为屈伸：小腿前踢 5°、后踢屈曲 120°。踝关节为俯仰与侧摆：脚背向上 60°、向下绷脚 30°，左右侧摆合计 25°。标称值是判定“转到头了没有”的依据，必须在测试前掌握。</w:t>
+      </w:r>
+    </w:p>
+    <w:p>
+      <w:r>
+        <w:rPr>
+          <w:rFonts w:hint="eastAsia"/>
+        </w:rPr>
+        <w:t>3.2 允许偏差与测量</w:t>
+      </w:r>
+    </w:p>
+    <w:p>
+      <w:pPr>
+        <w:ind w:firstLine="420"/>
+      </w:pPr>
+      <w:r>
+        <w:t>极限角度允许偏差为 ±2°，依据一体化关节旋转范围及装配公差确定。测量应在转轴处用角度尺进行，正反方向或往复多次取平均，避免单次读数抖动。实际角度相对标称值超差，须区分是机械干涉、零位不准还是限位参数错误。</w:t>
+      </w:r>
+    </w:p>
+    <w:p>
+      <w:r>
+        <w:rPr>
+          <w:rFonts w:hint="eastAsia"/>
+        </w:rPr>
+        <w:t>3.3 极限位干涉</w:t>
+      </w:r>
+    </w:p>
+    <w:p>
+      <w:pPr>
+        <w:ind w:firstLine="420"/>
+      </w:pPr>
+      <w:r>
+        <w:t>角度合格仍须检查极限位置有无结构干涉和线缆拉扯。角度到了但连杆碰撞、线束绷紧，同样判不合格。单关节测试时应固定相邻连杆，避免整链串动干扰读数。</w:t>
+      </w:r>
+    </w:p>
+    <w:p>
+      <w:r>
+        <w:rPr>
+          <w:rFonts w:hint="eastAsia"/>
+        </w:rPr>
+        <w:t>3.4 双腿对称</w:t>
+      </w:r>
+    </w:p>
+    <w:p>
+      <w:pPr>
+        <w:ind w:firstLine="420"/>
+      </w:pPr>
+      <w:r>
+        <w:t>左右腿同一关节的极限角度和零位姿态应对称：对应关节角度差不大于 1°，足部基准高度差不大于 1mm。不对称会造成行走偏斜。可通过髋座垫片和零位偏移微调，但不能用对称去掩盖单腿超差。</w:t>
+      </w:r>
+    </w:p>
+    <w:p>
+      <w:pPr>
+        <w:pStyle w:val="a9"/>
+        <w:numPr>
+          <w:ilvl w:val="0"/>
+          <w:numId w:val="24"/>
+        </w:numPr>
+        <w:rPr>
+          <w:rFonts w:asciiTheme="majorHAnsi" w:eastAsiaTheme="majorEastAsia" w:hAnsiTheme="majorHAnsi" w:cstheme="majorBidi"/>
+          <w:color w:val="0F4761" w:themeColor="accent1" w:themeShade="BF"/>
+          <w:sz w:val="32"/>
+          <w:szCs w:val="32"/>
+        </w:rPr>
+      </w:pPr>
+      <w:bookmarkStart w:id="0" w:name="OLE_LINK1"/>
+      <w:r>
+        <w:rPr>
+          <w:rFonts w:asciiTheme="majorHAnsi" w:eastAsiaTheme="majorEastAsia" w:hAnsiTheme="majorHAnsi" w:cstheme="majorBidi" w:hint="eastAsia"/>
+          <w:color w:val="0F4761" w:themeColor="accent1" w:themeShade="BF"/>
+          <w:sz w:val="32"/>
+          <w:szCs w:val="32"/>
+        </w:rPr>
+        <w:t>动态性能、耐久与缺陷闭环</w:t>
+      </w:r>
+    </w:p>
+    <w:p>
+      <w:r>
+        <w:rPr>
+          <w:rFonts w:hint="eastAsia"/>
+        </w:rPr>
+        <w:t>4.1 低速往复暴露装配缺陷</w:t>
+      </w:r>
+    </w:p>
+    <w:p>
+      <w:pPr>
+        <w:ind w:firstLine="420"/>
+      </w:pPr>
+      <w:r>
+        <w:t>动态测试从低速、单关节全行程往复开始（如 30% 额定转速、连续数分钟），用于暴露抖动、冲击异响、驱动报警、螺栓松动和线缆移位摩擦。高速之前必须先证明低速平稳。</w:t>
+      </w:r>
+    </w:p>
+    <w:p>
+      <w:r>
+        <w:rPr>
+          <w:rFonts w:hint="eastAsia"/>
+        </w:rPr>
+        <w:t>4.2 电参数与温升</w:t>
+      </w:r>
+    </w:p>
+    <w:p>
+      <w:pPr>
+        <w:ind w:firstLine="420"/>
+      </w:pPr>
+      <w:r>
+        <w:t>运行中应监控母线电压、绕组温度和输出电流。本任务判据为电压 72±1V、温度低于 75℃，电流须完整记录。电压不稳或温升过快，提示电源、负载或装配别劲，应停机排查。</w:t>
+      </w:r>
+    </w:p>
+    <w:p>
+      <w:r>
+        <w:rPr>
+          <w:rFonts w:hint="eastAsia"/>
+        </w:rPr>
+        <w:t>4.3 噪声</w:t>
+      </w:r>
+    </w:p>
+    <w:p>
+      <w:pPr>
+        <w:ind w:firstLine="420"/>
+      </w:pPr>
+      <w:r>
+        <w:t>静态噪声在使能、静止零位下测量，动态噪声在额定转速稳态下测量。测点应在距关节约 1m 的等高位置多点取平均。本任务静态小于 60 分贝、动态小于 75 分贝。噪声突变常对应轴承、齿轮或松动。</w:t>
+      </w:r>
+    </w:p>
+    <w:p>
+      <w:r>
+        <w:rPr>
+          <w:rFonts w:hint="eastAsia"/>
+        </w:rPr>
+        <w:t>4.4 耐久与复检</w:t>
+      </w:r>
+    </w:p>
+    <w:p>
+      <w:pPr>
+        <w:ind w:firstLine="420"/>
+      </w:pPr>
+      <w:r>
+        <w:t>工装固定下髋膝踝联动连续运行，考查短时无故障能力（本任务大于 10 分钟）。结束后须停机复检紧固件、线缆磨损和结构异响，不能只看“当时还能转”。</w:t>
+      </w:r>
+    </w:p>
+    <w:p>
+      <w:r>
+        <w:rPr>
+          <w:rFonts w:hint="eastAsia"/>
+        </w:rPr>
+        <w:t>4.5 缺陷分级与归档</w:t>
+      </w:r>
+    </w:p>
+    <w:p>
+      <w:pPr>
+        <w:ind w:firstLine="420"/>
+      </w:pPr>
+      <w:r>
+        <w:t>致命缺陷（卡死、过热烧毁、绝缘失效）立即停工，限时全项复测清零；严重缺陷（角度大幅超标、剧烈抖响、频繁过载）限时整改复测；一般缺陷进台账，验收前关闭。验收以全部测试项目合格且缺陷闭环为准，并归档完备性检查、零位与限位数据、动态台账、耐久记录和整改闭环资料。</w:t>
+      </w:r>
     </w:p>
     <w:p>
       <w:pPr>
@@ -8346,6 +8795,12 @@
     </w:lvlOverride>
   </w:num>
   <w:num w:numId="23">
+    <w:abstractNumId w:val="13"/>
+    <w:lvlOverride w:ilvl="0">
+      <w:startOverride w:val="1"/>
+    </w:lvlOverride>
+  </w:num>
+  <w:num w:numId="24">
     <w:abstractNumId w:val="13"/>
     <w:lvlOverride w:ilvl="0">
       <w:startOverride w:val="1"/>

</xml_diff>

<commit_message>
Expand Task 4 knowledge reserve into finer teaching units
Split 通电安全, 零位参数, 极限角度 and 动态验收 into per-criterion
subsections with indicators, failure modes, and pass conditions.

Co-authored-by: FrankBooom <FrankBooom@users.noreply.github.com>
</commit_message>
<xml_diff>
--- a/docs/项目二 腿部机械装配-已补全.docx
+++ b/docs/项目二 腿部机械装配-已补全.docx
@@ -3542,47 +3542,127 @@
         <w:rPr>
           <w:rFonts w:hint="eastAsia"/>
         </w:rPr>
-        <w:t>1.1 工装约束与电源条件</w:t>
-      </w:r>
-    </w:p>
-    <w:p>
-      <w:pPr>
-        <w:ind w:firstLine="420"/>
-      </w:pPr>
-      <w:r>
-        <w:t>通电转动测试必须把髋座刚性固定在工装上，使测量和驱动的反力由工装承受，而不是由未约束的整机晃动承受。驱动电源应与关节额定母线一致，本任务为 72V 稳压直流。环境、总成完整性未确认前，不得进入带电环节。</w:t>
-      </w:r>
-    </w:p>
-    <w:p>
-      <w:r>
-        <w:rPr>
-          <w:rFonts w:hint="eastAsia"/>
-        </w:rPr>
-        <w:t>1.2 断电检查线缆与紧固</w:t>
-      </w:r>
-    </w:p>
-    <w:p>
-      <w:pPr>
-        <w:ind w:firstLine="420"/>
-      </w:pPr>
-      <w:r>
-        <w:t>上电前必须在断电状态下检查：动力线与信号线插合、锁扣到位；CAN 总线与编码器线序无反接、错接；接头轻拉不脱落；走线有运动余量、无锐角弯折。同时按 BOM 核对结构件齐全、无变形，承力螺栓有拧紧标记、无错漏装滑丝，减震垫和线束防护件到位。接线错误或紧固缺失时通电，可能短路、飞车或结构松脱。</w:t>
-      </w:r>
-    </w:p>
-    <w:p>
-      <w:r>
-        <w:rPr>
-          <w:rFonts w:hint="eastAsia"/>
-        </w:rPr>
-        <w:t>1.3 绝缘与对地电压</w:t>
-      </w:r>
-    </w:p>
-    <w:p>
-      <w:pPr>
-        <w:ind w:firstLine="420"/>
-      </w:pPr>
-      <w:r>
-        <w:t>金属壳体、连杆、螺栓头对电源负极不应出现危险电位。用直流电压档在待机及不同电压等级下测量裸露金属，对地电压须小于 3V。绝缘失效属于致命缺陷，不得以“能转动”代替绝缘判断。</w:t>
+        <w:t>1.1 本任务在整腿流程中的位置</w:t>
+      </w:r>
+    </w:p>
+    <w:p>
+      <w:pPr>
+        <w:ind w:firstLine="420"/>
+      </w:pPr>
+      <w:r>
+        <w:t>任务4是装配之后的通电验证，不是再装一遍结构。工艺主线是静态校准、动态联调、故障整改、复检验收。静态解决“能不能安全上电、零位和参数对不对”；动态解决“转到极限和连续运行稳不稳”；整改验收解决“缺陷有没有闭环、记录能不能交付”。前序结构不合格，本任务测到的是装配缺陷，不是控制问题，应退回任务3，而不是靠改参数“调过去”。</w:t>
+      </w:r>
+    </w:p>
+    <w:p>
+      <w:r>
+        <w:rPr>
+          <w:rFonts w:hint="eastAsia"/>
+        </w:rPr>
+        <w:t>1.2 工装刚性固定</w:t>
+      </w:r>
+    </w:p>
+    <w:p>
+      <w:pPr>
+        <w:ind w:firstLine="420"/>
+      </w:pPr>
+      <w:r>
+        <w:t>髋座必须刚性固定。通电后关节输出力矩会通过髋座反作用到支撑上：工装松，腿体会晃，角度尺读数漂、零位对不稳，还可能把未约束的整机拖倒。固定的是髋座基准，不是把大小腿焊死；大小腿仍要能按测试要求活动。吊装架或专用支架应在驱动前确认无晃动、无干涉。</w:t>
+      </w:r>
+    </w:p>
+    <w:p>
+      <w:r>
+        <w:rPr>
+          <w:rFonts w:hint="eastAsia"/>
+        </w:rPr>
+        <w:t>1.3 电源与检测仪器</w:t>
+      </w:r>
+    </w:p>
+    <w:p>
+      <w:pPr>
+        <w:ind w:firstLine="420"/>
+      </w:pPr>
+      <w:r>
+        <w:t>本任务母线为 72V 稳压直流，电压应能稳定在后续监控窗口 72±1V 内。常用仪器及用途：高精度数显角度尺测关节实际转角；万用表直流电压档测对地电位；红外测温仪看绕组或壳体温升；声级计测静态/动态噪声；扭矩复检扳手核对承力螺栓。仪器应完好、在有效期内，不得用损坏表计代替。环境、总成不完整时，不得进入带电环节。</w:t>
+      </w:r>
+    </w:p>
+    <w:p>
+      <w:r>
+        <w:rPr>
+          <w:rFonts w:hint="eastAsia"/>
+        </w:rPr>
+        <w:t>1.4 动力线与信号线</w:t>
+      </w:r>
+    </w:p>
+    <w:p>
+      <w:pPr>
+        <w:ind w:firstLine="420"/>
+      </w:pPr>
+      <w:r>
+        <w:t>动力线传输驱动电流，信号线传输编码器或通信。两类线都要插合到位、锁扣锁死。插不到位会接触电阻大、发热或瞬间掉线；锁扣未扣会在运动中脱出。检查必须断电，禁止带电插拔。轻拉接头应不脱落，这是判断锁扣是否真正受力的方法。</w:t>
+      </w:r>
+    </w:p>
+    <w:p>
+      <w:r>
+        <w:rPr>
+          <w:rFonts w:hint="eastAsia"/>
+        </w:rPr>
+        <w:t>1.5 CAN 总线与编码器线序</w:t>
+      </w:r>
+    </w:p>
+    <w:p>
+      <w:pPr>
+        <w:ind w:firstLine="420"/>
+      </w:pPr>
+      <w:r>
+        <w:t>腿内部 CAN 与编码器线有固定线序和极性。反接、错接轻则通信失败、关节失能，重则损坏接口。线序核对的是“这一根进的是这个关节的这个口”，不能只看插头形状能插上。动力接对而编码器反了，电机会失控或方向相反，属于上电前必须排除的故障。</w:t>
+      </w:r>
+    </w:p>
+    <w:p>
+      <w:r>
+        <w:rPr>
+          <w:rFonts w:hint="eastAsia"/>
+        </w:rPr>
+        <w:t>1.6 走线余量与弯折</w:t>
+      </w:r>
+    </w:p>
+    <w:p>
+      <w:pPr>
+        <w:ind w:firstLine="420"/>
+      </w:pPr>
+      <w:r>
+        <w:t>转动测试会把关节送到极限，线束若在静态看起来整齐、极限位被拉直或折成锐角，接头会被拔、芯线会断。余量是否够，要用“还能再摆到头”来判断。锐角弯折、压在锐边或螺栓头上，耐久阶段会先磨破外皮。</w:t>
+      </w:r>
+    </w:p>
+    <w:p>
+      <w:r>
+        <w:rPr>
+          <w:rFonts w:hint="eastAsia"/>
+        </w:rPr>
+        <w:t>1.7 结构件与紧固件完备性</w:t>
+      </w:r>
+    </w:p>
+    <w:p>
+      <w:pPr>
+        <w:ind w:firstLine="420"/>
+      </w:pPr>
+      <w:r>
+        <w:t>通电前仍须按 BOM 核对髋座、大腿连杆、小腿连杆、踝关节支架、足部支撑件齐全、无变形破损。承力螺栓要看拧紧标记：有标记说明经过工艺扭矩；无标记、错装、漏装、滑丝，运转中可能松脱。减震垫、线束卡扣、护线套不到位，会在动态测试中变成异响或磨线源。合格条件是：连接无误且不松动；紧固件有拧紧标记、无错漏装。</w:t>
+      </w:r>
+    </w:p>
+    <w:p>
+      <w:r>
+        <w:rPr>
+          <w:rFonts w:hint="eastAsia"/>
+        </w:rPr>
+        <w:t>1.8 绝缘与对地电压</w:t>
+      </w:r>
+    </w:p>
+    <w:p>
+      <w:pPr>
+        <w:ind w:firstLine="420"/>
+      </w:pPr>
+      <w:r>
+        <w:t>壳体、连杆、螺栓头等裸露金属对电源负极不应带危险电位。测量用直流电压档，一支表笔接电源输出负极，另一支接触上述金属；须在待机以及低压、高压上电状态下都测，取最大值为准。合格判定：对地电压＜3V。超过 3V 视为绝缘异常或等电位不良，属于致命缺陷，不得进入关节点动。能转动不能代替绝缘合格。</w:t>
       </w:r>
     </w:p>
     <w:p>
@@ -3615,63 +3695,95 @@
         <w:rPr>
           <w:rFonts w:hint="eastAsia"/>
         </w:rPr>
-        <w:t>2.1 机械零位与电气零位</w:t>
-      </w:r>
-    </w:p>
-    <w:p>
-      <w:pPr>
-        <w:ind w:firstLine="420"/>
-      </w:pPr>
-      <w:r>
-        <w:t>机械零位是关节处于设计中立位时壳体与输出法兰刻度线的对齐状态；电气零位是驱动器保存的零点参数。装配后两者可能不一致，需要读取出厂零点、对比实际机械零位，必要时写入零点偏移。只看软件零点或只看刻度，都会把装配偏差带进运动。</w:t>
-      </w:r>
-    </w:p>
-    <w:p>
-      <w:r>
-        <w:rPr>
-          <w:rFonts w:hint="eastAsia"/>
-        </w:rPr>
-        <w:t>2.2 回零验证</w:t>
-      </w:r>
-    </w:p>
-    <w:p>
-      <w:pPr>
-        <w:ind w:firstLine="420"/>
-      </w:pPr>
-      <w:r>
-        <w:t>参数修改后应断电重启，再下发回零指令，确认回零姿态与机械中立位一致。回零失败说明偏移未生效、方向接反或机械卡滞，不得进入极限角度测试。</w:t>
-      </w:r>
-    </w:p>
-    <w:p>
-      <w:r>
-        <w:rPr>
-          <w:rFonts w:hint="eastAsia"/>
-        </w:rPr>
-        <w:t>2.3 控制参数的构成与版本</w:t>
-      </w:r>
-    </w:p>
-    <w:p>
-      <w:pPr>
-        <w:ind w:firstLine="420"/>
-      </w:pPr>
-      <w:r>
-        <w:t>腿部运动依赖位置环 PID、速度环 PID、转矩限幅和限位阈值。参数必须与关节标定固件版本匹配，内容完整、无缺失乱码。版本不一致会出现限幅失效、振荡或限位不起作用。</w:t>
-      </w:r>
-    </w:p>
-    <w:p>
-      <w:r>
-        <w:rPr>
-          <w:rFonts w:hint="eastAsia"/>
-        </w:rPr>
-        <w:t>2.4 下发与回读</w:t>
-      </w:r>
-    </w:p>
-    <w:p>
-      <w:pPr>
-        <w:ind w:firstLine="420"/>
-      </w:pPr>
-      <w:r>
-        <w:t>参数写入驱动器后必须重启回读，确认保存并生效。只下发不回读，无法证明控制器实际使用的就是导入文件。</w:t>
+        <w:t>2.1 中立位与刻度线</w:t>
+      </w:r>
+    </w:p>
+    <w:p>
+      <w:pPr>
+        <w:ind w:firstLine="420"/>
+      </w:pPr>
+      <w:r>
+        <w:t>设计中立位是各关节的机械参考姿态。壳体与输出法兰上的刻度线对齐，表示执行器连接部分处于中立。断电下手动摆到中立再看刻度，才能把“机械实际在哪”看清楚。刻度不对齐，后续软件零点再准，迈步姿态也会偏。</w:t>
+      </w:r>
+    </w:p>
+    <w:p>
+      <w:r>
+        <w:rPr>
+          <w:rFonts w:hint="eastAsia"/>
+        </w:rPr>
+        <w:t>2.2 机械零位、电气零位与偏移</w:t>
+      </w:r>
+    </w:p>
+    <w:p>
+      <w:pPr>
+        <w:ind w:firstLine="420"/>
+      </w:pPr>
+      <w:r>
+        <w:t>机械零位是中立姿态下的几何位置；电气零位是驱动器里保存的零点参数。出厂标定按单关节做，装进腿部后孔位、垫片、紧固都会带来装配偏差，所以必须把读到的出厂零点与当前机械零位对比。有偏差则写入零点偏移，用软件补偿装配误差，而不是硬扳结构去凑刻度。只改机械或只改软件，都会把偏差留给极限角和步态。</w:t>
+      </w:r>
+    </w:p>
+    <w:p>
+      <w:r>
+        <w:rPr>
+          <w:rFonts w:hint="eastAsia"/>
+        </w:rPr>
+        <w:t>2.3 回零验证</w:t>
+      </w:r>
+    </w:p>
+    <w:p>
+      <w:pPr>
+        <w:ind w:firstLine="420"/>
+      </w:pPr>
+      <w:r>
+        <w:t>偏移写入后要断电重启，让参数从非易失存储加载，再下发回零指令。回零后的姿态应与机械中立位、刻度线一致。回零失败的常见原因：偏移未保存、关节方向接反、机械卡滞、限位把回零挡住。回零不合格，不得测极限角度，否则标称值全部失去参照。</w:t>
+      </w:r>
+    </w:p>
+    <w:p>
+      <w:r>
+        <w:rPr>
+          <w:rFonts w:hint="eastAsia"/>
+        </w:rPr>
+        <w:t>2.4 位置环、速度环、转矩限幅与限位</w:t>
+      </w:r>
+    </w:p>
+    <w:p>
+      <w:pPr>
+        <w:ind w:firstLine="420"/>
+      </w:pPr>
+      <w:r>
+        <w:t>位置环 PID 决定跟位是否到位、是否振荡；速度环 PID 决定响应快慢与是否冲击；转矩限幅限制最大力矩，防止堵转烧毁；限位阈值给出软件行程边界，避免冲过机械极限。四类参数缺一，就会出现超调、发抖、无力或撞结构。学员应能说出每一类参数管什么，而不是把文件当作黑盒导入。</w:t>
+      </w:r>
+    </w:p>
+    <w:p>
+      <w:r>
+        <w:rPr>
+          <w:rFonts w:hint="eastAsia"/>
+        </w:rPr>
+        <w:t>2.5 版本匹配与文件完整性</w:t>
+      </w:r>
+    </w:p>
+    <w:p>
+      <w:pPr>
+        <w:ind w:firstLine="420"/>
+      </w:pPr>
+      <w:r>
+        <w:t>控制参数必须与该关节标定固件版本一致。版本不对，PID 单位、限位极性或限幅范围可能完全不同。导入前检查文件无缺失、无乱码，关节与文件一一对应，禁止把左腿文件下到右腿、把膝参数下到髋。</w:t>
+      </w:r>
+    </w:p>
+    <w:p>
+      <w:r>
+        <w:rPr>
+          <w:rFonts w:hint="eastAsia"/>
+        </w:rPr>
+        <w:t>2.6 下发、重启与回读</w:t>
+      </w:r>
+    </w:p>
+    <w:p>
+      <w:pPr>
+        <w:ind w:firstLine="420"/>
+      </w:pPr>
+      <w:r>
+        <w:t>写入驱动器后重启再回读，逐项对照导入值。只显示“下发成功”不能证明存储器里就是这份参数。回读不一致应重新导入，不得带着未知参数做极限测试。合格条件：版本、内容、完整性均符合要求。</w:t>
       </w:r>
     </w:p>
     <w:p>
@@ -3704,63 +3816,111 @@
         <w:rPr>
           <w:rFonts w:hint="eastAsia"/>
         </w:rPr>
-        <w:t>3.1 关节自由度与标称行程</w:t>
-      </w:r>
-    </w:p>
-    <w:p>
-      <w:pPr>
-        <w:ind w:firstLine="420"/>
-      </w:pPr>
-      <w:r>
-        <w:t>髋关节含俯仰、侧摆和旋转：俯仰向前抬腿 108°、向后摆腿 77°；侧摆向内 10°、向外 25°；内外旋转合计 40°。膝关节为屈伸：小腿前踢 5°、后踢屈曲 120°。踝关节为俯仰与侧摆：脚背向上 60°、向下绷脚 30°，左右侧摆合计 25°。标称值是判定“转到头了没有”的依据，必须在测试前掌握。</w:t>
-      </w:r>
-    </w:p>
-    <w:p>
-      <w:r>
-        <w:rPr>
-          <w:rFonts w:hint="eastAsia"/>
-        </w:rPr>
-        <w:t>3.2 允许偏差与测量</w:t>
-      </w:r>
-    </w:p>
-    <w:p>
-      <w:pPr>
-        <w:ind w:firstLine="420"/>
-      </w:pPr>
-      <w:r>
-        <w:t>极限角度允许偏差为 ±2°，依据一体化关节旋转范围及装配公差确定。测量应在转轴处用角度尺进行，正反方向或往复多次取平均，避免单次读数抖动。实际角度相对标称值超差，须区分是机械干涉、零位不准还是限位参数错误。</w:t>
-      </w:r>
-    </w:p>
-    <w:p>
-      <w:r>
-        <w:rPr>
-          <w:rFonts w:hint="eastAsia"/>
-        </w:rPr>
-        <w:t>3.3 极限位干涉</w:t>
-      </w:r>
-    </w:p>
-    <w:p>
-      <w:pPr>
-        <w:ind w:firstLine="420"/>
-      </w:pPr>
-      <w:r>
-        <w:t>角度合格仍须检查极限位置有无结构干涉和线缆拉扯。角度到了但连杆碰撞、线束绷紧，同样判不合格。单关节测试时应固定相邻连杆，避免整链串动干扰读数。</w:t>
-      </w:r>
-    </w:p>
-    <w:p>
-      <w:r>
-        <w:rPr>
-          <w:rFonts w:hint="eastAsia"/>
-        </w:rPr>
-        <w:t>3.4 双腿对称</w:t>
-      </w:r>
-    </w:p>
-    <w:p>
-      <w:pPr>
-        <w:ind w:firstLine="420"/>
-      </w:pPr>
-      <w:r>
-        <w:t>左右腿同一关节的极限角度和零位姿态应对称：对应关节角度差不大于 1°，足部基准高度差不大于 1mm。不对称会造成行走偏斜。可通过髋座垫片和零位偏移微调，但不能用对称去掩盖单腿超差。</w:t>
+        <w:t>3.1 允许偏差 ±2°</w:t>
+      </w:r>
+    </w:p>
+    <w:p>
+      <w:pPr>
+        <w:ind w:firstLine="420"/>
+      </w:pPr>
+      <w:r>
+        <w:t>极限角允许偏差 ±2°，依据一体化关节旋转范围测试逻辑和装配公差确定。小于该窗口视为达到设计行程，大于则超差。超差时要先分清三类原因：机械撞上了（干涉、装配偏）；零位偏了（中立不准，正负行程一长一短）；软件限位设窄或设反。原因不同，整改对象不同。</w:t>
+      </w:r>
+    </w:p>
+    <w:p>
+      <w:r>
+        <w:rPr>
+          <w:rFonts w:hint="eastAsia"/>
+        </w:rPr>
+        <w:t>3.2 测量通则</w:t>
+      </w:r>
+    </w:p>
+    <w:p>
+      <w:pPr>
+        <w:ind w:firstLine="420"/>
+      </w:pPr>
+      <w:r>
+        <w:t>角度在关节转轴处读取，不要在远离转轴的杆端估读。正、反方向（或往复）各测若干次取平均，本任务要求各方向测 3 次，以抑制手持角度尺抖动。单关节测试时固定相邻连杆，避免整链串动把别的关节角度叠进去。驱动应缓慢点动到极限，便于同时看干涉和线缆。</w:t>
+      </w:r>
+    </w:p>
+    <w:p>
+      <w:r>
+        <w:rPr>
+          <w:rFonts w:hint="eastAsia"/>
+        </w:rPr>
+        <w:t>3.3 髋关节标称行程</w:t>
+      </w:r>
+    </w:p>
+    <w:p>
+      <w:pPr>
+        <w:ind w:firstLine="420"/>
+      </w:pPr>
+      <w:r>
+        <w:t>髋有俯仰、侧摆、旋转三个方向。标称值：俯仰向前抬腿 108°、向后摆腿 77°；侧摆向内 10°、向外 25°；旋转内外合计 40°。三个方向都要测到正、反极限，不能用抬腿代替侧摆。极限位须无结构干涉、无卡滞、无线缆拉扯，且与标称值偏差 ≤±2°。</w:t>
+      </w:r>
+    </w:p>
+    <w:p>
+      <w:r>
+        <w:rPr>
+          <w:rFonts w:hint="eastAsia"/>
+        </w:rPr>
+        <w:t>3.4 膝关节标称行程</w:t>
+      </w:r>
+    </w:p>
+    <w:p>
+      <w:pPr>
+        <w:ind w:firstLine="420"/>
+      </w:pPr>
+      <w:r>
+        <w:t>膝为屈伸。标称值：小腿前踢 5°、后踢屈曲 120°。测量的是大小腿夹角再换算成屈伸角，不是髋座相对地面的倾角。测试时固定大腿姿态，只驱动膝，检查极限位连杆不碰撞、线缆不挤压。偏差同样 ≤±2°。</w:t>
+      </w:r>
+    </w:p>
+    <w:p>
+      <w:r>
+        <w:rPr>
+          <w:rFonts w:hint="eastAsia"/>
+        </w:rPr>
+        <w:t>3.5 踝关节标称行程</w:t>
+      </w:r>
+    </w:p>
+    <w:p>
+      <w:pPr>
+        <w:ind w:firstLine="420"/>
+      </w:pPr>
+      <w:r>
+        <w:t>踝为俯仰与侧摆。标称值：脚背向上抬起 60°、向下绷脚背 30°；左右侧摆合计 25°。测量足板相对小腿的实际偏转，测试时固定小腿。须确认足部极限与小腿结构无干涉，偏差 ≤±2°。</w:t>
+      </w:r>
+    </w:p>
+    <w:p>
+      <w:r>
+        <w:rPr>
+          <w:rFonts w:hint="eastAsia"/>
+        </w:rPr>
+        <w:t>3.6 极限位的结构与线束</w:t>
+      </w:r>
+    </w:p>
+    <w:p>
+      <w:pPr>
+        <w:ind w:firstLine="420"/>
+      </w:pPr>
+      <w:r>
+        <w:t>角度到了只说明驱动器和编码器认为到了限位。若连杆相碰、垫片刮擦、线束绷直或卡入剪切口，仍判不合格。极限位是干涉最容易出现的位置，也是走线余量是否足够的最终检验。</w:t>
+      </w:r>
+    </w:p>
+    <w:p>
+      <w:r>
+        <w:rPr>
+          <w:rFonts w:hint="eastAsia"/>
+        </w:rPr>
+        <w:t>3.7 双腿对称度</w:t>
+      </w:r>
+    </w:p>
+    <w:p>
+      <w:pPr>
+        <w:ind w:firstLine="420"/>
+      </w:pPr>
+      <w:r>
+        <w:t>左右腿同一关节的极限角、零位姿态应对称：对应关节角度差 ≤1°，足部基准高度差 ≤1mm。不对称会在步行中表现为偏斜、一侧先落地。微调手段：髋座安装垫片改机械高度/倾角，零位偏移改电气中立。规则是先保证单腿自身 ≤±2°，再用垫片和偏移把双腿差收到 1°/1mm 以内，不能用“两边平均一下”掩盖单腿超差。</w:t>
       </w:r>
     </w:p>
     <w:p>
@@ -3793,79 +3953,95 @@
         <w:rPr>
           <w:rFonts w:hint="eastAsia"/>
         </w:rPr>
-        <w:t>4.1 低速往复暴露装配缺陷</w:t>
-      </w:r>
-    </w:p>
-    <w:p>
-      <w:pPr>
-        <w:ind w:firstLine="420"/>
-      </w:pPr>
-      <w:r>
-        <w:t>动态测试从低速、单关节全行程往复开始（如 30% 额定转速、连续数分钟），用于暴露抖动、冲击异响、驱动报警、螺栓松动和线缆移位摩擦。高速之前必须先证明低速平稳。</w:t>
-      </w:r>
-    </w:p>
-    <w:p>
-      <w:r>
-        <w:rPr>
-          <w:rFonts w:hint="eastAsia"/>
-        </w:rPr>
-        <w:t>4.2 电参数与温升</w:t>
-      </w:r>
-    </w:p>
-    <w:p>
-      <w:pPr>
-        <w:ind w:firstLine="420"/>
-      </w:pPr>
-      <w:r>
-        <w:t>运行中应监控母线电压、绕组温度和输出电流。本任务判据为电压 72±1V、温度低于 75℃，电流须完整记录。电压不稳或温升过快，提示电源、负载或装配别劲，应停机排查。</w:t>
-      </w:r>
-    </w:p>
-    <w:p>
-      <w:r>
-        <w:rPr>
-          <w:rFonts w:hint="eastAsia"/>
-        </w:rPr>
-        <w:t>4.3 噪声</w:t>
-      </w:r>
-    </w:p>
-    <w:p>
-      <w:pPr>
-        <w:ind w:firstLine="420"/>
-      </w:pPr>
-      <w:r>
-        <w:t>静态噪声在使能、静止零位下测量，动态噪声在额定转速稳态下测量。测点应在距关节约 1m 的等高位置多点取平均。本任务静态小于 60 分贝、动态小于 75 分贝。噪声突变常对应轴承、齿轮或松动。</w:t>
-      </w:r>
-    </w:p>
-    <w:p>
-      <w:r>
-        <w:rPr>
-          <w:rFonts w:hint="eastAsia"/>
-        </w:rPr>
-        <w:t>4.4 耐久与复检</w:t>
-      </w:r>
-    </w:p>
-    <w:p>
-      <w:pPr>
-        <w:ind w:firstLine="420"/>
-      </w:pPr>
-      <w:r>
-        <w:t>工装固定下髋膝踝联动连续运行，考查短时无故障能力（本任务大于 10 分钟）。结束后须停机复检紧固件、线缆磨损和结构异响，不能只看“当时还能转”。</w:t>
-      </w:r>
-    </w:p>
-    <w:p>
-      <w:r>
-        <w:rPr>
-          <w:rFonts w:hint="eastAsia"/>
-        </w:rPr>
-        <w:t>4.5 缺陷分级与归档</w:t>
-      </w:r>
-    </w:p>
-    <w:p>
-      <w:pPr>
-        <w:ind w:firstLine="420"/>
-      </w:pPr>
-      <w:r>
-        <w:t>致命缺陷（卡死、过热烧毁、绝缘失效）立即停工，限时全项复测清零；严重缺陷（角度大幅超标、剧烈抖响、频繁过载）限时整改复测；一般缺陷进台账，验收前关闭。验收以全部测试项目合格且缺陷闭环为准，并归档完备性检查、零位与限位数据、动态台账、耐久记录和整改闭环资料。</w:t>
+        <w:t>4.1 单关节低速往复</w:t>
+      </w:r>
+    </w:p>
+    <w:p>
+      <w:pPr>
+        <w:ind w:firstLine="420"/>
+      </w:pPr>
+      <w:r>
+        <w:t>动态从单关节、全行程、低速开始。本任务采用 30% 额定转速点动，单关节连续运行 5 分钟。观察项：运动是否平稳；有无抖动、冲击异响；有无驱动报警；紧固件是否松动；线缆是否移位、摩擦。低速都无法平稳，不得升速或做联动。髋、膝、踝要逐个做，不能用一个关节代替整腿。</w:t>
+      </w:r>
+    </w:p>
+    <w:p>
+      <w:r>
+        <w:rPr>
+          <w:rFonts w:hint="eastAsia"/>
+        </w:rPr>
+        <w:t>4.2 母线电压、温度与电流</w:t>
+      </w:r>
+    </w:p>
+    <w:p>
+      <w:pPr>
+        <w:ind w:firstLine="420"/>
+      </w:pPr>
+      <w:r>
+        <w:t>连续运行中由上位机读取母线电压、绕组温度、输出电流。采集节奏：每 2 分钟一组，不少于 5 组有效数据。合格窗口：电压 72±1V；温度＜75℃；电流完整留存。电压跌出窗口提示电源或线阻；温度逼近 75℃提示别劲、堵转或散热不良；电流缺失等于没有过程证据。异常应停机，先查机械再查电气。</w:t>
+      </w:r>
+    </w:p>
+    <w:p>
+      <w:r>
+        <w:rPr>
+          <w:rFonts w:hint="eastAsia"/>
+        </w:rPr>
+        <w:t>4.3 静态噪声与动态噪声</w:t>
+      </w:r>
+    </w:p>
+    <w:p>
+      <w:pPr>
+        <w:ind w:firstLine="420"/>
+      </w:pPr>
+      <w:r>
+        <w:t>静态：上电使能、静止零位，测的是电磁和静止机械背景。动态：额定转速稳态运行，测的是轴承、传动和结构共振。声级计距关节 1m、等高，前后左右上 5 个点位，每点 3 次取算术平均，避免对着风扇口或贴着壳体乱测。合格：静态＜60 分贝，动态＜75 分贝。噪声突然增大，优先查松动、缺润滑和碰擦。</w:t>
+      </w:r>
+    </w:p>
+    <w:p>
+      <w:r>
+        <w:rPr>
+          <w:rFonts w:hint="eastAsia"/>
+        </w:rPr>
+        <w:t>4.4 耐久运行与停机复检</w:t>
+      </w:r>
+    </w:p>
+    <w:p>
+      <w:pPr>
+        <w:ind w:firstLine="420"/>
+      </w:pPr>
+      <w:r>
+        <w:t>工装固定下做髋膝踝联动屈伸、摆动，连续不间断运行，全程监视温度、电流、报警，记录累计时长。合格：无故障连续运行大于 10 分钟。停机后必须复检紧固件松动、线缆磨损、结构异响。耐久看的是“还能不能继续用”，不是“十分钟里有没有停”。</w:t>
+      </w:r>
+    </w:p>
+    <w:p>
+      <w:r>
+        <w:rPr>
+          <w:rFonts w:hint="eastAsia"/>
+        </w:rPr>
+        <w:t>4.5 缺陷分级</w:t>
+      </w:r>
+    </w:p>
+    <w:p>
+      <w:pPr>
+        <w:ind w:firstLine="420"/>
+      </w:pPr>
+      <w:r>
+        <w:t>致命缺陷：关节卡死、电机过热烧毁、绝缘失效。立即停工，24 小时内全项目复测清零，不得降级放行。严重缺陷：角度大幅超标、运行剧烈抖响、频繁过载报警。48 小时内优化并复测。一般/轻微缺陷：进缺陷台账，腿部验收前全部关闭。分级的意义是把人身与设备安全、功能成败和外观毛病分开处理，禁止把致命缺陷当成“再跑一次试试”。</w:t>
+      </w:r>
+    </w:p>
+    <w:p>
+      <w:r>
+        <w:rPr>
+          <w:rFonts w:hint="eastAsia"/>
+        </w:rPr>
+        <w:t>4.6 验收与归档</w:t>
+      </w:r>
+    </w:p>
+    <w:p>
+      <w:pPr>
+        <w:ind w:firstLine="420"/>
+      </w:pPr>
+      <w:r>
+        <w:t>验收条件：全部测试项目合格，全部缺陷闭环。缺一项数据或一项缺陷未关闭，不能出合格结论。归档资料至少包括：腿部完备性检查记录表；关节零位复核与硬限位标定数据；动态性能测试台账；耐久运行记录；缺陷整改闭环记录。记录应能追溯到关节、方向、测次和判定，禁止事后补造。</w:t>
       </w:r>
     </w:p>
     <w:p>

</xml_diff>

<commit_message>
Drop Task 3/4 knowledge and skills already taught in Task 2
Remove repeated cleanliness, axis-hole alignment, diagonal fastening,
harness slack, and ankle manual ROM; keep chain assembly, hip Roll,
powered limits, and electrical test items.

Co-authored-by: FrankBooom <FrankBooom@users.noreply.github.com>
</commit_message>
<xml_diff>
--- a/docs/项目二 腿部机械装配-已补全.docx
+++ b/docs/项目二 腿部机械装配-已补全.docx
@@ -2166,7 +2166,7 @@
         </w:rPr>
       </w:pPr>
       <w:r>
-        <w:t xml:space="preserve">本任务在足端单元预装合格的基础上，自下而上完成小腿、膝关节、大腿及髋关节电机的分段装配与总成整合。学员按“分段装配、逐级校验”实施，掌握连杆基准与变形检查、定位孔同轴、关节轴心垂直、左右 Roll 件防错、凹槽走线及伸直、折叠、抬腿、摆动联动预检，形成可转入转动测试的腿部主体结构。</w:t>
+        <w:t xml:space="preserve">本任务在足端单元预装合格的基础上，自下而上完成小腿、膝关节、大腿及髋关节电机的分段装配与总成整合。学员按“分段装配、逐级校验”实施，掌握连杆变形检查、定位孔同轴与偏心偏移、髋关节前摆/侧摆及左右 Roll 件防错、伸直折叠抬腿摆动联动预检，形成可转入转动测试的腿部主体结构。基准清洁、轴心垂直、分步紧固与线束余量沿用任务2，本任务不再重复讲授。</w:t>
       </w:r>
     </w:p>
     <w:p>
@@ -2216,12 +2216,12 @@
     </w:p>
     <w:p>
       <w:r>
-        <w:t>连杆安装端面清洁与弯曲、扭曲变形对分段装配基准传递的影响</w:t>
-      </w:r>
-    </w:p>
-    <w:p>
-      <w:r>
-        <w:t>定位孔同轴、关节轴心与连杆垂直及无明显偏心、偏移的几何要求</w:t>
+        <w:t>连杆弯曲、扭曲变形对分段装配基准传递的影响</w:t>
+      </w:r>
+    </w:p>
+    <w:p>
+      <w:r>
+        <w:t>定位孔同轴及无明显偏心、偏移的要求</w:t>
       </w:r>
     </w:p>
     <w:p>
@@ -2236,7 +2236,7 @@
     </w:p>
     <w:p>
       <w:r>
-        <w:t>结构凹槽走线规避干涉及伸直、折叠、抬腿、摆动联动预检判定</w:t>
+        <w:t>伸直、折叠、抬腿、摆动联动预检与单段合格的区别</w:t>
       </w:r>
     </w:p>
     <w:p>
@@ -2249,7 +2249,7 @@
     </w:p>
     <w:p>
       <w:r>
-        <w:t>能清理大、小腿连杆上下安装端面及膝关节安装孔位，检查连杆无弯曲、扭曲变形，确认基准面平整、干净</w:t>
+        <w:t>能检查大、小腿连杆无弯曲、扭曲变形，确认安装端面可作为下一段装配基准</w:t>
       </w:r>
     </w:p>
     <w:p>
@@ -2259,7 +2259,7 @@
     </w:p>
     <w:p>
       <w:r>
-        <w:t>能将膝关节电机模组安装至小腿上端基座，校准轴心与连杆垂直，沿凹槽走线后对接大腿支撑板</w:t>
+        <w:t>能将膝关节电机模组安装至小腿上端基座并对接大腿支撑板，形成中段主体结构</w:t>
       </w:r>
     </w:p>
     <w:p>
@@ -2269,12 +2269,7 @@
     </w:p>
     <w:p>
       <w:r>
-        <w:t>能将线缆沿支撑板凹槽向足后部引出，避免与周边结构干涉</w:t>
-      </w:r>
-    </w:p>
-    <w:p>
-      <w:r>
-        <w:t>能手动完成腿部伸直、折叠、抬腿、摆动，判定运动顺畅、无结构干涉、无碰撞卡顿</w:t>
+        <w:t>能手动完成腿部伸直、折叠、抬腿、摆动，判定整链运动顺畅、无碰撞卡顿</w:t>
       </w:r>
     </w:p>
     <w:p>
@@ -2302,12 +2297,7 @@
     </w:p>
     <w:p>
       <w:r>
-        <w:t>走线与结构同步考虑，不把干涉留到通电以后</w:t>
-      </w:r>
-    </w:p>
-    <w:p>
-      <w:r>
-        <w:t>联动预检不通过不转序</w:t>
+        <w:t>不以拧紧纠正连杆变形，联动预检不通过不转序</w:t>
       </w:r>
     </w:p>
     <w:p>
@@ -2501,7 +2491,7 @@
         <w:ind w:firstLine="420"/>
       </w:pPr>
       <w:r>
-        <w:t>大、小腿支撑板（连杆）构成腿部承力骨架，上下安装端面和关节孔位是装配基准，不是简单装饰面。端面不平整、孔口有杂质，对接后会出现张口或单边贴合；板面弯曲或扭曲，会使两端孔系不再共面、共轴，后续电机法兰必然歪斜。装配前必须把连杆当作“基准件”来检查，而不是当作可以靠螺栓拉直的弹性件。</w:t>
+        <w:t>大、小腿支撑板（连杆）构成腿部承力骨架，上下安装端面和关节孔位是下一段的输入基准。板面弯曲或扭曲会使两端孔系不再共面、共轴，后续电机法兰必然歪斜。装配前必须把连杆当作“基准件”检查变形，而不是当作可以靠螺栓拉直的弹性件。配合面清洁、去屑去油的方法见任务2，本任务不再重复。</w:t>
       </w:r>
     </w:p>
     <w:p>
@@ -2517,7 +2507,7 @@
         <w:ind w:firstLine="420"/>
       </w:pPr>
       <w:r>
-        <w:t>弯曲主要表现为侧视棱线不平、端面不能同时贴合；扭曲表现为两端安装面相对扭转，对角孔一高一低。两类变形都会破坏定位孔同轴和关节轴心垂直。明显变形的连杆不得装配，不能靠交叉拧紧“扳回来”，否则会把内应力锁进结构，运动中出现别劲、卡顿或螺栓松退。</w:t>
+        <w:t>弯曲主要表现为侧视棱线不平、端面不能同时贴合；扭曲表现为两端安装面相对扭转，对角孔一高一低。两类变形都会破坏定位孔同轴和关节轴心垂直。明显变形的连杆不得装配，不能靠交叉拧紧“扳回来”，否则会把内应力锁进结构，运动中出现别劲、卡顿或螺栓松退。关节定位几何</w:t>
       </w:r>
     </w:p>
     <w:p>
@@ -2566,31 +2556,15 @@
         <w:rPr>
           <w:rFonts w:hint="eastAsia"/>
         </w:rPr>
-        <w:t>2.2 轴心与连杆垂直</w:t>
-      </w:r>
-    </w:p>
-    <w:p>
-      <w:pPr>
-        <w:ind w:firstLine="420"/>
-      </w:pPr>
-      <w:r>
-        <w:t>关节电机的回转轴线应相对连杆轴线（或安装面）垂直。不垂直时，屈伸或摆动会走出圆锥轨迹，出现平面外摆动、连杆刮擦或轴承偏载。校准轴心，本质是在紧固前消除倾侧，而不是紧固后靠手感判断。四周缝隙均匀、无明显偏心偏移，才允许锁止。</w:t>
-      </w:r>
-    </w:p>
-    <w:p>
-      <w:r>
-        <w:rPr>
-          <w:rFonts w:hint="eastAsia"/>
-        </w:rPr>
-        <w:t>2.3 段与段对接</w:t>
-      </w:r>
-    </w:p>
-    <w:p>
-      <w:pPr>
-        <w:ind w:firstLine="420"/>
-      </w:pPr>
-      <w:r>
-        <w:t>膝关节锁止后，大腿支撑板与膝关节总成对接，形成中段主体。对接顺序应保护已校准的膝轴：连接螺栓按序、分次锁紧，避免单边先死把膝轴拉斜。前序总成是后序的安装基准，对接口有偏移应松开重对，不得在错位状态下继续加力。</w:t>
+        <w:t>2.2 段与段对接</w:t>
+      </w:r>
+    </w:p>
+    <w:p>
+      <w:pPr>
+        <w:ind w:firstLine="420"/>
+      </w:pPr>
+      <w:r>
+        <w:t>膝关节锁止后，大腿支撑板与膝关节总成对接，形成中段主体。轴心垂直、对角分次紧固的原则见任务2，本任务强调的是保护已校准的膝轴：连接螺栓按序、分次锁紧，避免单边先死把膝轴拉斜。前序总成是后序的安装基准，对接口有偏移应松开重对，不得在错位状态下继续加力。髋关节构型与左右件</w:t>
       </w:r>
     </w:p>
     <w:p>
@@ -2679,7 +2653,7 @@
         <w:ind w:firstLine="420"/>
       </w:pPr>
       <w:r>
-        <w:t>Roll 连接件是大腿侧摆的机械接口，应先与髋部安装位对正紧固，再将侧摆电机装到连接件上。连接件装斜，侧摆轴随之倾斜；电机在歪斜接口上紧固，只会把偏心锁死。叠装链上每一级都要求无明显偏心、偏移。</w:t>
+        <w:t>Roll 连接件是大腿侧摆的机械接口，应先与髋部安装位对正紧固，再将侧摆电机装到连接件上。连接件装斜，侧摆轴随之倾斜；电机在歪斜接口上紧固，只会把偏心锁死。叠装链上每一级都要求无明显偏心、偏移。联动预检</w:t>
       </w:r>
     </w:p>
     <w:p>
@@ -2704,71 +2678,39 @@
           <w:sz w:val="32"/>
           <w:szCs w:val="32"/>
         </w:rPr>
-        <w:t>结构走线与联动预检</w:t>
-      </w:r>
-    </w:p>
-    <w:p>
-      <w:r>
-        <w:rPr>
-          <w:rFonts w:hint="eastAsia"/>
-        </w:rPr>
-        <w:t>4.1 沿结构引导走线</w:t>
-      </w:r>
-    </w:p>
-    <w:p>
-      <w:pPr>
-        <w:ind w:firstLine="420"/>
-      </w:pPr>
-      <w:r>
-        <w:t>线缆应走结构提供的凹槽、让位和后出线路径，而不是最短直线。小腿段典型要求是沿支撑板凹槽向足后部引出，使行走时线束位于运动包络之外。走线与结构装配同步进行，避免先锁死再撬缝穿线。</w:t>
-      </w:r>
-    </w:p>
-    <w:p>
-      <w:r>
-        <w:rPr>
-          <w:rFonts w:hint="eastAsia"/>
-        </w:rPr>
-        <w:t>4.2 运动干涉</w:t>
-      </w:r>
-    </w:p>
-    <w:p>
-      <w:pPr>
-        <w:ind w:firstLine="420"/>
-      </w:pPr>
-      <w:r>
-        <w:t>大小腿相对折叠、髋部抬腿和侧摆时，线束和凸出件都可能进入对方包络。干涉发生在极限位和中间交叉位，静态整齐不能代替摆动检查。全程须避开锐边、螺栓头和转动剪切口，并为关节行程预留余量。</w:t>
-      </w:r>
-    </w:p>
-    <w:p>
-      <w:r>
-        <w:rPr>
-          <w:rFonts w:hint="eastAsia"/>
-        </w:rPr>
-        <w:t>4.3 单段合格与联动合格</w:t>
-      </w:r>
-    </w:p>
-    <w:p>
-      <w:pPr>
-        <w:ind w:firstLine="420"/>
-      </w:pPr>
-      <w:r>
-        <w:t>单段对位合格，不等于整链运动合格。联动预检是在断电条件下，手动做伸直、折叠、抬腿、摆动，检查关节链是否顺畅。伸直暴露膝、髋是否顶死；折叠暴露小腿与大腿是否碰擦；抬腿、摆动暴露髋前摆与侧摆是否别劲。无结构干涉、无碰撞卡顿，才算主体结构装配合格。</w:t>
-      </w:r>
-    </w:p>
-    <w:p>
-      <w:r>
-        <w:rPr>
-          <w:rFonts w:hint="eastAsia"/>
-        </w:rPr>
-        <w:t>4.4 转序条件</w:t>
-      </w:r>
-    </w:p>
-    <w:p>
-      <w:pPr>
-        <w:ind w:firstLine="420"/>
-      </w:pPr>
-      <w:r>
-        <w:t>转入转动测试前应同时满足：连杆无变形、基准面清洁；各段定位孔同轴、轴心垂直、无明显偏心偏移；左右件正确；线束沿结构引出且不干涉；伸直、折叠、抬腿、摆动手动运动顺畅。不满足则不具备进入通电调试的条件。</w:t>
+        <w:t>联动预检</w:t>
+      </w:r>
+    </w:p>
+    <w:p>
+      <w:r>
+        <w:rPr>
+          <w:rFonts w:hint="eastAsia"/>
+        </w:rPr>
+        <w:t>4.1 单段合格与联动合格</w:t>
+      </w:r>
+    </w:p>
+    <w:p>
+      <w:pPr>
+        <w:ind w:firstLine="420"/>
+      </w:pPr>
+      <w:r>
+        <w:t>动力线与信号线的区分、行程余量和避死角原则见任务2。本任务新增的是整链运动：单段对位合格，不等于伸直、折叠、抬腿、摆动都合格。联动预检在断电下手动进行。伸直暴露膝、髋是否顶死；折叠暴露小腿与大腿是否碰擦；抬腿、摆动暴露髋前摆与侧摆是否别劲。无碰撞卡顿，才算主体结构装配合格。</w:t>
+      </w:r>
+    </w:p>
+    <w:p>
+      <w:r>
+        <w:rPr>
+          <w:rFonts w:hint="eastAsia"/>
+        </w:rPr>
+        <w:t>4.2 转序条件</w:t>
+      </w:r>
+    </w:p>
+    <w:p>
+      <w:pPr>
+        <w:ind w:firstLine="420"/>
+      </w:pPr>
+      <w:r>
+        <w:t>转入转动测试前应同时满足：连杆无变形；各段定位孔同轴、无明显偏心偏移；左右 Roll 件正确；伸直、折叠、抬腿、摆动手动运动顺畅。清洁贴合、轴心垂直、线束余量已在任务2判定的，本任务只复核是否被后续装配破坏。不满足则不具备进入通电调试的条件。</w:t>
       </w:r>
     </w:p>
     <w:p>
@@ -3281,7 +3223,7 @@
     </w:p>
     <w:p>
       <w:r>
-        <w:t>通电前线缆、紧固件完备性检查及绝缘对地电压的合格条件</w:t>
+        <w:t>通电前绝缘对地电压、CAN/编码器线序及拧紧标记的合格条件</w:t>
       </w:r>
     </w:p>
     <w:p>
@@ -3314,7 +3256,7 @@
     </w:p>
     <w:p>
       <w:r>
-        <w:t>能搭建髋座固定工装，在断电状态下检查动力线、信号线、CAN/编码器线序及承力螺栓拧紧标记</w:t>
+        <w:t>能搭建髋座固定工装，断电检查 CAN/编码器线序及承力螺栓拧紧标记</w:t>
       </w:r>
     </w:p>
     <w:p>
@@ -3329,12 +3271,12 @@
     </w:p>
     <w:p>
       <w:r>
-        <w:t>能在单关节点动下测量髋、膝、踝极限角度，判定与标称值偏差≤±2°且极限位无干涉</w:t>
-      </w:r>
-    </w:p>
-    <w:p>
-      <w:r>
-        <w:t>能开展全行程往复、电参数采集和噪声测试，记录电压、温度、噪声数据</w:t>
+        <w:t>能在单关节点动下测量髋、膝、踝极限角度，判定与标称值偏差≤±2°</w:t>
+      </w:r>
+    </w:p>
+    <w:p>
+      <w:r>
+        <w:t>能开展往复运动、电参数采集和噪声测试，记录电压、温度、噪声数据</w:t>
       </w:r>
     </w:p>
     <w:p>
@@ -3590,15 +3532,15 @@
         <w:rPr>
           <w:rFonts w:hint="eastAsia"/>
         </w:rPr>
-        <w:t>1.4 动力线与信号线</w:t>
-      </w:r>
-    </w:p>
-    <w:p>
-      <w:pPr>
-        <w:ind w:firstLine="420"/>
-      </w:pPr>
-      <w:r>
-        <w:t>动力线传输驱动电流，信号线传输编码器或通信。两类线都要插合到位、锁扣锁死。插不到位会接触电阻大、发热或瞬间掉线；锁扣未扣会在运动中脱出。检查必须断电，禁止带电插拔。轻拉接头应不脱落，这是判断锁扣是否真正受力的方法。</w:t>
+        <w:t>1.4 通电前接插与锁扣</w:t>
+      </w:r>
+    </w:p>
+    <w:p>
+      <w:pPr>
+        <w:ind w:firstLine="420"/>
+      </w:pPr>
+      <w:r>
+        <w:t>动力线与信号线的区分、行程余量和避死角见任务2，本任务不再讲授布置方法。通电前只复核：接头插合到位、锁扣锁死、轻拉不脱落。插不到位会发热或掉线，锁扣未扣会在点动中脱出。检查必须断电，禁止带电插拔。</w:t>
       </w:r>
     </w:p>
     <w:p>
@@ -3622,72 +3564,31 @@
         <w:rPr>
           <w:rFonts w:hint="eastAsia"/>
         </w:rPr>
-        <w:t>1.6 走线余量与弯折</w:t>
-      </w:r>
-    </w:p>
-    <w:p>
-      <w:pPr>
-        <w:ind w:firstLine="420"/>
-      </w:pPr>
-      <w:r>
-        <w:t>转动测试会把关节送到极限，线束若在静态看起来整齐、极限位被拉直或折成锐角，接头会被拔、芯线会断。余量是否够，要用“还能再摆到头”来判断。锐角弯折、压在锐边或螺栓头上，耐久阶段会先磨破外皮。</w:t>
-      </w:r>
-    </w:p>
-    <w:p>
-      <w:r>
-        <w:rPr>
-          <w:rFonts w:hint="eastAsia"/>
-        </w:rPr>
-        <w:t>1.7 结构件与紧固件完备性</w:t>
-      </w:r>
-    </w:p>
-    <w:p>
-      <w:pPr>
-        <w:ind w:firstLine="420"/>
-      </w:pPr>
-      <w:r>
-        <w:t>通电前仍须按 BOM 核对髋座、大腿连杆、小腿连杆、踝关节支架、足部支撑件齐全、无变形破损。承力螺栓要看拧紧标记：有标记说明经过工艺扭矩；无标记、错装、漏装、滑丝，运转中可能松脱。减震垫、线束卡扣、护线套不到位，会在动态测试中变成异响或磨线源。合格条件是：连接无误且不松动；紧固件有拧紧标记、无错漏装。</w:t>
-      </w:r>
-    </w:p>
-    <w:p>
-      <w:r>
-        <w:rPr>
-          <w:rFonts w:hint="eastAsia"/>
-        </w:rPr>
-        <w:t>1.8 绝缘与对地电压</w:t>
-      </w:r>
-    </w:p>
-    <w:p>
-      <w:pPr>
-        <w:ind w:firstLine="420"/>
-      </w:pPr>
-      <w:r>
-        <w:t>壳体、连杆、螺栓头等裸露金属对电源负极不应带危险电位。测量用直流电压档，一支表笔接电源输出负极，另一支接触上述金属；须在待机以及低压、高压上电状态下都测，取最大值为准。合格判定：对地电压＜3V。超过 3V 视为绝缘异常或等电位不良，属于致命缺陷，不得进入关节点动。能转动不能代替绝缘合格。</w:t>
-      </w:r>
-    </w:p>
-    <w:p>
-      <w:pPr>
-        <w:pStyle w:val="a9"/>
-        <w:numPr>
-          <w:ilvl w:val="0"/>
-          <w:numId w:val="24"/>
-        </w:numPr>
-        <w:rPr>
-          <w:rFonts w:asciiTheme="majorHAnsi" w:eastAsiaTheme="majorEastAsia" w:hAnsiTheme="majorHAnsi" w:cstheme="majorBidi"/>
-          <w:color w:val="0F4761" w:themeColor="accent1" w:themeShade="BF"/>
-          <w:sz w:val="32"/>
-          <w:szCs w:val="32"/>
-        </w:rPr>
-      </w:pPr>
-      <w:bookmarkStart w:id="0" w:name="OLE_LINK1"/>
-      <w:r>
-        <w:rPr>
-          <w:rFonts w:asciiTheme="majorHAnsi" w:eastAsiaTheme="majorEastAsia" w:hAnsiTheme="majorHAnsi" w:cstheme="majorBidi" w:hint="eastAsia"/>
-          <w:color w:val="0F4761" w:themeColor="accent1" w:themeShade="BF"/>
-          <w:sz w:val="32"/>
-          <w:szCs w:val="32"/>
-        </w:rPr>
-        <w:t>零位与控制参数</w:t>
+        <w:t>1.6 拧紧标记与结构完备性</w:t>
+      </w:r>
+    </w:p>
+    <w:p>
+      <w:pPr>
+        <w:ind w:firstLine="420"/>
+      </w:pPr>
+      <w:r>
+        <w:t>对角交叉分次紧固、过紧过松的危害见任务2。本任务不重做预紧教学，只查通电前状态：承力螺栓有拧紧标记、无错漏装滑丝；按 BOM 核对髋座、大腿连杆、小腿连杆、踝支架、足部支撑件齐全无变形。无标记或漏装，运转中可能松脱。合格条件是：连接无误且不松动；紧固件有拧紧标记、无错漏装。</w:t>
+      </w:r>
+    </w:p>
+    <w:p>
+      <w:r>
+        <w:rPr>
+          <w:rFonts w:hint="eastAsia"/>
+        </w:rPr>
+        <w:t>1.7 绝缘与对地电压</w:t>
+      </w:r>
+    </w:p>
+    <w:p>
+      <w:pPr>
+        <w:ind w:firstLine="420"/>
+      </w:pPr>
+      <w:r>
+        <w:t>壳体、连杆、螺栓头等裸露金属对电源负极不应带危险电位。测量用直流电压档，一支表笔接电源输出负极，另一支接触上述金属；须在待机以及低压、高压上电状态下都测，取最大值为准。合格判定：对地电压＜3V。超过 3V 视为绝缘异常或等电位不良，属于致命缺陷，不得进入关节点动。能转动不能代替绝缘合格。零位与控制参数</w:t>
       </w:r>
     </w:p>
     <w:p>
@@ -3783,32 +3684,7 @@
         <w:ind w:firstLine="420"/>
       </w:pPr>
       <w:r>
-        <w:t>写入驱动器后重启再回读，逐项对照导入值。只显示“下发成功”不能证明存储器里就是这份参数。回读不一致应重新导入，不得带着未知参数做极限测试。合格条件：版本、内容、完整性均符合要求。</w:t>
-      </w:r>
-    </w:p>
-    <w:p>
-      <w:pPr>
-        <w:pStyle w:val="a9"/>
-        <w:numPr>
-          <w:ilvl w:val="0"/>
-          <w:numId w:val="24"/>
-        </w:numPr>
-        <w:rPr>
-          <w:rFonts w:asciiTheme="majorHAnsi" w:eastAsiaTheme="majorEastAsia" w:hAnsiTheme="majorHAnsi" w:cstheme="majorBidi"/>
-          <w:color w:val="0F4761" w:themeColor="accent1" w:themeShade="BF"/>
-          <w:sz w:val="32"/>
-          <w:szCs w:val="32"/>
-        </w:rPr>
-      </w:pPr>
-      <w:bookmarkStart w:id="0" w:name="OLE_LINK1"/>
-      <w:r>
-        <w:rPr>
-          <w:rFonts w:asciiTheme="majorHAnsi" w:eastAsiaTheme="majorEastAsia" w:hAnsiTheme="majorHAnsi" w:cstheme="majorBidi" w:hint="eastAsia"/>
-          <w:color w:val="0F4761" w:themeColor="accent1" w:themeShade="BF"/>
-          <w:sz w:val="32"/>
-          <w:szCs w:val="32"/>
-        </w:rPr>
-        <w:t>极限角度与对称度</w:t>
+        <w:t>写入驱动器后重启再回读，逐项对照导入值。只显示“下发成功”不能证明存储器里就是这份参数。回读不一致应重新导入，不得带着未知参数做极限测试。合格条件：版本、内容、完整性均符合要求。极限角度与对称度</w:t>
       </w:r>
     </w:p>
     <w:p>
@@ -3896,15 +3772,15 @@
         <w:rPr>
           <w:rFonts w:hint="eastAsia"/>
         </w:rPr>
-        <w:t>3.6 极限位的结构与线束</w:t>
-      </w:r>
-    </w:p>
-    <w:p>
-      <w:pPr>
-        <w:ind w:firstLine="420"/>
-      </w:pPr>
-      <w:r>
-        <w:t>角度到了只说明驱动器和编码器认为到了限位。若连杆相碰、垫片刮擦、线束绷直或卡入剪切口，仍判不合格。极限位是干涉最容易出现的位置，也是走线余量是否足够的最终检验。</w:t>
+        <w:t>3.6 通电极限位复核</w:t>
+      </w:r>
+    </w:p>
+    <w:p>
+      <w:pPr>
+        <w:ind w:firstLine="420"/>
+      </w:pPr>
+      <w:r>
+        <w:t>干涉、卡顿、异响的判定见任务2的手动全行程自检。本任务是在通电、量化极限角条件下复核：编码器显示到位后，仍须确认连杆未碰、线束未被拉脱。任务2未覆盖的是带力矩、带限位参数时的冲限与对称问题。</w:t>
       </w:r>
     </w:p>
     <w:p>
@@ -3920,32 +3796,7 @@
         <w:ind w:firstLine="420"/>
       </w:pPr>
       <w:r>
-        <w:t>左右腿同一关节的极限角、零位姿态应对称：对应关节角度差 ≤1°，足部基准高度差 ≤1mm。不对称会在步行中表现为偏斜、一侧先落地。微调手段：髋座安装垫片改机械高度/倾角，零位偏移改电气中立。规则是先保证单腿自身 ≤±2°，再用垫片和偏移把双腿差收到 1°/1mm 以内，不能用“两边平均一下”掩盖单腿超差。</w:t>
-      </w:r>
-    </w:p>
-    <w:p>
-      <w:pPr>
-        <w:pStyle w:val="a9"/>
-        <w:numPr>
-          <w:ilvl w:val="0"/>
-          <w:numId w:val="24"/>
-        </w:numPr>
-        <w:rPr>
-          <w:rFonts w:asciiTheme="majorHAnsi" w:eastAsiaTheme="majorEastAsia" w:hAnsiTheme="majorHAnsi" w:cstheme="majorBidi"/>
-          <w:color w:val="0F4761" w:themeColor="accent1" w:themeShade="BF"/>
-          <w:sz w:val="32"/>
-          <w:szCs w:val="32"/>
-        </w:rPr>
-      </w:pPr>
-      <w:bookmarkStart w:id="0" w:name="OLE_LINK1"/>
-      <w:r>
-        <w:rPr>
-          <w:rFonts w:asciiTheme="majorHAnsi" w:eastAsiaTheme="majorEastAsia" w:hAnsiTheme="majorHAnsi" w:cstheme="majorBidi" w:hint="eastAsia"/>
-          <w:color w:val="0F4761" w:themeColor="accent1" w:themeShade="BF"/>
-          <w:sz w:val="32"/>
-          <w:szCs w:val="32"/>
-        </w:rPr>
-        <w:t>动态性能、耐久与缺陷闭环</w:t>
+        <w:t>左右腿同一关节的极限角、零位姿态应对称：对应关节角度差 ≤1°，足部基准高度差 ≤1mm。不对称会在步行中表现为偏斜、一侧先落地。微调手段：髋座安装垫片改机械高度/倾角，零位偏移改电气中立。规则是先保证单腿自身 ≤±2°，再用垫片和偏移把双腿差收到 1°/1mm 以内，不能用“两边平均一下”掩盖单腿超差。动态性能、耐久与缺陷闭环</w:t>
       </w:r>
     </w:p>
     <w:p>

</xml_diff>

<commit_message>
Generalize Task 3 knowledge points into principle-level titles
Replace part-specific bullets with datum transfer, deformation,
locating geometry, multi-DOF/mirrors, and chain vs segment inspection.

Co-authored-by: FrankBooom <FrankBooom@users.noreply.github.com>
</commit_message>
<xml_diff>
--- a/docs/项目二 腿部机械装配-已补全.docx
+++ b/docs/项目二 腿部机械装配-已补全.docx
@@ -2166,7 +2166,7 @@
         </w:rPr>
       </w:pPr>
       <w:r>
-        <w:t xml:space="preserve">本任务在足端单元预装合格的基础上，自下而上完成小腿、膝关节、大腿及髋关节电机的分段装配与总成整合。学员按“分段装配、逐级校验”实施，掌握连杆变形检查、定位孔同轴与偏心偏移、髋关节前摆/侧摆及左右 Roll 件防错、伸直折叠抬腿摆动联动预检，形成可转入转动测试的腿部主体结构。基准清洁、轴心垂直、分步紧固与线束余量沿用任务2，本任务不再重复讲授。</w:t>
+        <w:t xml:space="preserve">本任务在足端单元预装合格的基础上，完成腿部中段与近端的分段装配与总成整合。学员按“分段装配、逐级校验”实施，掌握基准传递、承力件变形、定位几何、多自由度与镜像件防错、整链联动检验，形成可转入转动测试的腿部主体结构。基准清洁、轴心垂直、分步紧固与线束余量沿用任务2，本任务不再重复讲授。</w:t>
       </w:r>
     </w:p>
     <w:p>
@@ -2216,27 +2216,27 @@
     </w:p>
     <w:p>
       <w:r>
-        <w:t>连杆弯曲、扭曲变形对分段装配基准传递的影响</w:t>
-      </w:r>
-    </w:p>
-    <w:p>
-      <w:r>
-        <w:t>定位孔同轴及无明显偏心、偏移的要求</w:t>
-      </w:r>
-    </w:p>
-    <w:p>
-      <w:r>
-        <w:t>自下而上分段装配、逐级校验的基准传递关系</w:t>
-      </w:r>
-    </w:p>
-    <w:p>
-      <w:r>
-        <w:t>髋关节前摆与侧摆电机的功能差异及左右 Roll 件不可混装的原因</w:t>
-      </w:r>
-    </w:p>
-    <w:p>
-      <w:r>
-        <w:t>伸直、折叠、抬腿、摆动联动预检与单段合格的区别</w:t>
+        <w:t>串联运动链分段装配的基准传递与误差叠加</w:t>
+      </w:r>
+    </w:p>
+    <w:p>
+      <w:r>
+        <w:t>承力件变形对孔系精度的影响及不得以紧固纠正的原因</w:t>
+      </w:r>
+    </w:p>
+    <w:p>
+      <w:r>
+        <w:t>同轴、偏心、偏移的含义及对接判定原则</w:t>
+      </w:r>
+    </w:p>
+    <w:p>
+      <w:r>
+        <w:t>多自由度关节分工与镜像件不可互换的原因</w:t>
+      </w:r>
+    </w:p>
+    <w:p>
+      <w:r>
+        <w:t>单段合格与整链联动检验的区别</w:t>
       </w:r>
     </w:p>
     <w:p>
@@ -2467,47 +2467,47 @@
         <w:rPr>
           <w:rFonts w:hint="eastAsia"/>
         </w:rPr>
-        <w:t>1.1 自下而上的装配逻辑</w:t>
-      </w:r>
-    </w:p>
-    <w:p>
-      <w:pPr>
-        <w:ind w:firstLine="420"/>
-      </w:pPr>
-      <w:r>
-        <w:t>串联运动链应按已合格单元向上延伸：先有可靠的足端，再装小腿，再装膝，再装大腿与髋。每一段的输出面是下一段的输入基准。跳步或颠倒顺序，会把前序误差叠加到后序孔位和轴心上，拆解成本高。分段装配的要点是“一段合格，再接下一段”，而不是一次堆齐再总拧。</w:t>
-      </w:r>
-    </w:p>
-    <w:p>
-      <w:r>
-        <w:rPr>
-          <w:rFonts w:hint="eastAsia"/>
-        </w:rPr>
-        <w:t>1.2 连杆的承力与基准面</w:t>
-      </w:r>
-    </w:p>
-    <w:p>
-      <w:pPr>
-        <w:ind w:firstLine="420"/>
-      </w:pPr>
-      <w:r>
-        <w:t>大、小腿支撑板（连杆）构成腿部承力骨架，上下安装端面和关节孔位是下一段的输入基准。板面弯曲或扭曲会使两端孔系不再共面、共轴，后续电机法兰必然歪斜。装配前必须把连杆当作“基准件”检查变形，而不是当作可以靠螺栓拉直的弹性件。配合面清洁、去屑去油的方法见任务2，本任务不再重复。</w:t>
-      </w:r>
-    </w:p>
-    <w:p>
-      <w:r>
-        <w:rPr>
-          <w:rFonts w:hint="eastAsia"/>
-        </w:rPr>
-        <w:t>1.3 弯曲、扭曲对孔系的破坏</w:t>
-      </w:r>
-    </w:p>
-    <w:p>
-      <w:pPr>
-        <w:ind w:firstLine="420"/>
-      </w:pPr>
-      <w:r>
-        <w:t>弯曲主要表现为侧视棱线不平、端面不能同时贴合；扭曲表现为两端安装面相对扭转，对角孔一高一低。两类变形都会破坏定位孔同轴和关节轴心垂直。明显变形的连杆不得装配，不能靠交叉拧紧“扳回来”，否则会把内应力锁进结构，运动中出现别劲、卡顿或螺栓松退。关节定位几何</w:t>
+        <w:t>1.1 基准传递</w:t>
+      </w:r>
+    </w:p>
+    <w:p>
+      <w:pPr>
+        <w:ind w:firstLine="420"/>
+      </w:pPr>
+      <w:r>
+        <w:t>串联结构只能按已合格单元向上延伸。每一段的输出面是下一段的输入基准。跳步或颠倒顺序，会把前序误差叠加到后序孔位和轴心上。分段装配的要点是“一段合格，再接下一段”，而不是一次堆齐再总拧。</w:t>
+      </w:r>
+    </w:p>
+    <w:p>
+      <w:r>
+        <w:rPr>
+          <w:rFonts w:hint="eastAsia"/>
+        </w:rPr>
+        <w:t>1.2 承力件与基准面</w:t>
+      </w:r>
+    </w:p>
+    <w:p>
+      <w:pPr>
+        <w:ind w:firstLine="420"/>
+      </w:pPr>
+      <w:r>
+        <w:t>连杆类承力件的安装端面和孔系是几何基准，不是可随意拉形的弹性件。端面或孔系失准则后续执行器轴线必然歪斜。配合面清洁方法见任务2；本任务要建立的是“先承认基准、再决定能否装配”。</w:t>
+      </w:r>
+    </w:p>
+    <w:p>
+      <w:r>
+        <w:rPr>
+          <w:rFonts w:hint="eastAsia"/>
+        </w:rPr>
+        <w:t>1.3 变形不得靠紧固纠正</w:t>
+      </w:r>
+    </w:p>
+    <w:p>
+      <w:pPr>
+        <w:ind w:firstLine="420"/>
+      </w:pPr>
+      <w:r>
+        <w:t>弯曲使棱线不平、端面不能同时贴合；扭曲使两端相对扭转、对角孔高低不一。两类变形都会破坏同轴和对接。明显变形的承力件不得进入装配，不能靠加大预紧“扳直”，否则内应力锁进结构，运动中出现别劲、松退。</w:t>
       </w:r>
     </w:p>
     <w:p>
@@ -2532,39 +2532,39 @@
           <w:sz w:val="32"/>
           <w:szCs w:val="32"/>
         </w:rPr>
-        <w:t>关节定位几何</w:t>
-      </w:r>
-    </w:p>
-    <w:p>
-      <w:r>
-        <w:rPr>
-          <w:rFonts w:hint="eastAsia"/>
-        </w:rPr>
-        <w:t>2.1 定位孔同轴</w:t>
-      </w:r>
-    </w:p>
-    <w:p>
-      <w:pPr>
-        <w:ind w:firstLine="420"/>
-      </w:pPr>
-      <w:r>
-        <w:t>两件对接时，定位孔应重合，螺栓垂直自由穿入。孔位不一致会产生偏心或偏移：轴线平行但错位是偏心，孔系整体错档是偏移。小腿支撑板与踝关节定位孔不同轴，误差会传到膝、髋，表现为整腿外撇、内扣或足面不水平。对位看的是孔与缝，不是“看起来差不多”。</w:t>
-      </w:r>
-    </w:p>
-    <w:p>
-      <w:r>
-        <w:rPr>
-          <w:rFonts w:hint="eastAsia"/>
-        </w:rPr>
-        <w:t>2.2 段与段对接</w:t>
-      </w:r>
-    </w:p>
-    <w:p>
-      <w:pPr>
-        <w:ind w:firstLine="420"/>
-      </w:pPr>
-      <w:r>
-        <w:t>膝关节锁止后，大腿支撑板与膝关节总成对接，形成中段主体。轴心垂直、对角分次紧固的原则见任务2，本任务强调的是保护已校准的膝轴：连接螺栓按序、分次锁紧，避免单边先死把膝轴拉斜。前序总成是后序的安装基准，对接口有偏移应松开重对，不得在错位状态下继续加力。髋关节构型与左右件</w:t>
+        <w:t>定位几何</w:t>
+      </w:r>
+    </w:p>
+    <w:p>
+      <w:r>
+        <w:rPr>
+          <w:rFonts w:hint="eastAsia"/>
+        </w:rPr>
+        <w:t>2.1 同轴、偏心与偏移</w:t>
+      </w:r>
+    </w:p>
+    <w:p>
+      <w:pPr>
+        <w:ind w:firstLine="420"/>
+      </w:pPr>
+      <w:r>
+        <w:t>两件对接时，定位孔应重合，紧固件能垂直自由穿入。轴线平行但错位称为偏心，孔系整体错档称为偏移。对位看孔与缝是否一致，不能凭外形“看起来差不多”。前段不同轴，误差会沿运动链向后传递。</w:t>
+      </w:r>
+    </w:p>
+    <w:p>
+      <w:r>
+        <w:rPr>
+          <w:rFonts w:hint="eastAsia"/>
+        </w:rPr>
+        <w:t>2.2 段间对接</w:t>
+      </w:r>
+    </w:p>
+    <w:p>
+      <w:pPr>
+        <w:ind w:firstLine="420"/>
+      </w:pPr>
+      <w:r>
+        <w:t>后段对接必须保护前段已经校准的轴线。紧固应分次、按序，避免单边先锁死把已校基准拉斜。对接口有偏移应松开重对，不得在错位状态下继续加力。轴心垂直与对角分次紧固的操作原则见任务2。</w:t>
       </w:r>
     </w:p>
     <w:p>
@@ -2589,23 +2589,23 @@
           <w:sz w:val="32"/>
           <w:szCs w:val="32"/>
         </w:rPr>
-        <w:t>髋关节构型与左右件</w:t>
-      </w:r>
-    </w:p>
-    <w:p>
-      <w:r>
-        <w:rPr>
-          <w:rFonts w:hint="eastAsia"/>
-        </w:rPr>
-        <w:t>3.1 前摆与侧摆两个自由度</w:t>
-      </w:r>
-    </w:p>
-    <w:p>
-      <w:pPr>
-        <w:ind w:firstLine="420"/>
-      </w:pPr>
-      <w:r>
-        <w:t>髋部通常分解为前摆（屈伸/抬腿方向）和侧摆（内收外展方向），由两台电机分别实现。安装位置、接口方向和出线口都不同，不能互换。先理解两个自由度在步态中的作用，才能判断电机应落在大腿上方安装位还是 Roll 连接件上。</w:t>
+        <w:t>多自由度与镜像件</w:t>
+      </w:r>
+    </w:p>
+    <w:p>
+      <w:r>
+        <w:rPr>
+          <w:rFonts w:hint="eastAsia"/>
+        </w:rPr>
+        <w:t>3.1 同一部位的多个自由度</w:t>
+      </w:r>
+    </w:p>
+    <w:p>
+      <w:pPr>
+        <w:ind w:firstLine="420"/>
+      </w:pPr>
+      <w:r>
+        <w:t>一个部位若存在两个以上独立转动方向，通常由不同执行器、不同安装位实现，接口方向不能互换。装配前先分清各自由度对应哪一个接口，再决定执行器落点。</w:t>
       </w:r>
     </w:p>
     <w:p>
@@ -2621,39 +2621,39 @@
         <w:ind w:firstLine="420"/>
       </w:pPr>
       <w:r>
-        <w:t>髋部装配前，须先把腿部姿态校准到设计垂直状态。已装的膝关节可作为机械参照：以膝轴为基准调整整腿垂直度，再将大腿下端面与前序总成对齐。基准漂了，髋轴会带着整腿前倾、后仰或侧倾进入后续测试。</w:t>
-      </w:r>
-    </w:p>
-    <w:p>
-      <w:r>
-        <w:rPr>
-          <w:rFonts w:hint="eastAsia"/>
-        </w:rPr>
-        <w:t>3.3 左右镜像件不可混装</w:t>
-      </w:r>
-    </w:p>
-    <w:p>
-      <w:pPr>
-        <w:ind w:firstLine="420"/>
-      </w:pPr>
-      <w:r>
-        <w:t>大腿支撑板分左右，Roll 关节连接件也分左右，安装面、孔向和走线口相反。装反会导致侧摆方向接反、结构干涉或整机偏斜。左右件必须在上机前按标识核对，不能靠“能拧上”判断对错。</w:t>
-      </w:r>
-    </w:p>
-    <w:p>
-      <w:r>
-        <w:rPr>
-          <w:rFonts w:hint="eastAsia"/>
-        </w:rPr>
-        <w:t>3.4 连接件与侧摆电机的叠装关系</w:t>
-      </w:r>
-    </w:p>
-    <w:p>
-      <w:pPr>
-        <w:ind w:firstLine="420"/>
-      </w:pPr>
-      <w:r>
-        <w:t>Roll 连接件是大腿侧摆的机械接口，应先与髋部安装位对正紧固，再将侧摆电机装到连接件上。连接件装斜，侧摆轴随之倾斜；电机在歪斜接口上紧固，只会把偏心锁死。叠装链上每一级都要求无明显偏心、偏移。联动预检</w:t>
+        <w:t>后段装配前，须把结构姿态校准到设计中立。已装关节可作为机械参照，用来恢复整体垂直或对中。姿态基准漂了，后装轴线会把倾侧带入整链。</w:t>
+      </w:r>
+    </w:p>
+    <w:p>
+      <w:r>
+        <w:rPr>
+          <w:rFonts w:hint="eastAsia"/>
+        </w:rPr>
+        <w:t>3.3 镜像件不可互换</w:t>
+      </w:r>
+    </w:p>
+    <w:p>
+      <w:pPr>
+        <w:ind w:firstLine="420"/>
+      </w:pPr>
+      <w:r>
+        <w:t>左右对称结构中的连接件往往互为镜像：安装面、孔向、走线口相反。能拧上不等于装对。装反会导致运动方向接反、结构干涉或整机偏斜。上机前按标识核对左右，不能靠试装判断。</w:t>
+      </w:r>
+    </w:p>
+    <w:p>
+      <w:r>
+        <w:rPr>
+          <w:rFonts w:hint="eastAsia"/>
+        </w:rPr>
+        <w:t>3.4 接口件与执行器的叠装</w:t>
+      </w:r>
+    </w:p>
+    <w:p>
+      <w:pPr>
+        <w:ind w:firstLine="420"/>
+      </w:pPr>
+      <w:r>
+        <w:t>先装机械接口件、再装执行器。接口件装斜，后装轴线随之倾斜；在歪斜接口上紧固，只会把偏心锁死。叠装链上每一级都要求无明显偏心、偏移。</w:t>
       </w:r>
     </w:p>
     <w:p>
@@ -2678,23 +2678,23 @@
           <w:sz w:val="32"/>
           <w:szCs w:val="32"/>
         </w:rPr>
-        <w:t>联动预检</w:t>
-      </w:r>
-    </w:p>
-    <w:p>
-      <w:r>
-        <w:rPr>
-          <w:rFonts w:hint="eastAsia"/>
-        </w:rPr>
-        <w:t>4.1 单段合格与联动合格</w:t>
-      </w:r>
-    </w:p>
-    <w:p>
-      <w:pPr>
-        <w:ind w:firstLine="420"/>
-      </w:pPr>
-      <w:r>
-        <w:t>动力线与信号线的区分、行程余量和避死角原则见任务2。本任务新增的是整链运动：单段对位合格，不等于伸直、折叠、抬腿、摆动都合格。联动预检在断电下手动进行。伸直暴露膝、髋是否顶死；折叠暴露小腿与大腿是否碰擦；抬腿、摆动暴露髋前摆与侧摆是否别劲。无碰撞卡顿，才算主体结构装配合格。</w:t>
+        <w:t>整链检验</w:t>
+      </w:r>
+    </w:p>
+    <w:p>
+      <w:r>
+        <w:rPr>
+          <w:rFonts w:hint="eastAsia"/>
+        </w:rPr>
+        <w:t>4.1 单段合格与整链合格</w:t>
+      </w:r>
+    </w:p>
+    <w:p>
+      <w:pPr>
+        <w:ind w:firstLine="420"/>
+      </w:pPr>
+      <w:r>
+        <w:t>线束余量与避死角见任务2。本任务新增的是：单段对位合格，不等于整链在各主要自由度上都能走通。联动预检在断电下手动进行，应覆盖伸展、折叠和侧向等组合运动，用来暴露段与段之间的顶死、碰擦和别劲。无碰撞卡顿，才算主体结构装配合格。</w:t>
       </w:r>
     </w:p>
     <w:p>
@@ -2710,7 +2710,7 @@
         <w:ind w:firstLine="420"/>
       </w:pPr>
       <w:r>
-        <w:t>转入转动测试前应同时满足：连杆无变形；各段定位孔同轴、无明显偏心偏移；左右 Roll 件正确；伸直、折叠、抬腿、摆动手动运动顺畅。清洁贴合、轴心垂直、线束余量已在任务2判定的，本任务只复核是否被后续装配破坏。不满足则不具备进入通电调试的条件。</w:t>
+        <w:t>转入通电测试前，应同时满足：承力件无变形；各段同轴、无明显偏心偏移；镜像件左右正确；整链手动运动顺畅。任务2已判定的清洁、垂直和线束余量，本任务只复核是否被后续装配破坏。不满足则不具备转序条件。</w:t>
       </w:r>
     </w:p>
     <w:p>

</xml_diff>